<commit_message>
Sequences: laws and formulas in colour (blue), results in red, in PDF and Word
Co-Authored-By: Claude Opus 5.5 <noreply@anthropic.com>
Claude-Session: https://claude.ai/code/session_015WVgZKTbSWpZTjn6aZsqC9
</commit_message>
<xml_diff>
--- a/documents/3as/modhakirat/modhakira_wahda5_3as.docx
+++ b/documents/3as/modhakirat/modhakira_wahda5_3as.docx
@@ -2439,7 +2439,7 @@
                     <a:graphicData uri="http://schemas.openxmlformats.org/drawingml/2006/picture">
                       <pic:pic>
                         <pic:nvPicPr>
-                          <pic:cNvPr id="0" name="1ee82ce0ad4e977b.png"/>
+                          <pic:cNvPr id="0" name="716dc51613cb6093.png"/>
                           <pic:cNvPicPr/>
                         </pic:nvPicPr>
                         <pic:blipFill>
@@ -3022,11 +3022,17 @@
               <m:sSub>
                 <m:e>
                   <m:r>
+                    <w:rPr>
+                      <w:color w:val="1F4E9C"/>
+                    </w:rPr>
                     <m:t>u</m:t>
                   </m:r>
                 </m:e>
                 <m:sub>
                   <m:r>
+                    <w:rPr>
+                      <w:color w:val="1F4E9C"/>
+                    </w:rPr>
                     <m:t>n</m:t>
                   </m:r>
                 </m:sub>
@@ -3035,9 +3041,15 @@
                 <m:rPr>
                   <m:sty m:val="p"/>
                 </m:rPr>
+                <w:rPr>
+                  <w:color w:val="1F4E9C"/>
+                </w:rPr>
                 <m:t>=</m:t>
               </m:r>
               <m:r>
+                <w:rPr>
+                  <w:color w:val="1F4E9C"/>
+                </w:rPr>
                 <m:t>f</m:t>
               </m:r>
               <m:d>
@@ -3049,6 +3061,9 @@
                 </m:dPr>
                 <m:e>
                   <m:r>
+                    <w:rPr>
+                      <w:color w:val="1F4E9C"/>
+                    </w:rPr>
                     <m:t>n</m:t>
                   </m:r>
                 </m:e>
@@ -3076,11 +3091,17 @@
               <m:sSub>
                 <m:e>
                   <m:r>
+                    <w:rPr>
+                      <w:color w:val="1F4E9C"/>
+                    </w:rPr>
                     <m:t>u</m:t>
                   </m:r>
                 </m:e>
                 <m:sub>
                   <m:r>
+                    <w:rPr>
+                      <w:color w:val="1F4E9C"/>
+                    </w:rPr>
                     <m:t>n</m:t>
                   </m:r>
                 </m:sub>
@@ -3089,6 +3110,9 @@
                 <m:rPr>
                   <m:sty m:val="p"/>
                 </m:rPr>
+                <w:rPr>
+                  <w:color w:val="1F4E9C"/>
+                </w:rPr>
                 <m:t>=</m:t>
               </m:r>
               <m:f>
@@ -3097,32 +3121,53 @@
                 </m:fPr>
                 <m:num>
                   <m:r>
+                    <w:rPr>
+                      <w:color w:val="1F4E9C"/>
+                    </w:rPr>
                     <m:t>2</m:t>
                   </m:r>
                   <m:r>
+                    <w:rPr>
+                      <w:color w:val="1F4E9C"/>
+                    </w:rPr>
                     <m:t>n</m:t>
                   </m:r>
                   <m:r>
                     <m:rPr>
                       <m:sty m:val="p"/>
                     </m:rPr>
+                    <w:rPr>
+                      <w:color w:val="1F4E9C"/>
+                    </w:rPr>
                     <m:t>+</m:t>
                   </m:r>
                   <m:r>
+                    <w:rPr>
+                      <w:color w:val="1F4E9C"/>
+                    </w:rPr>
                     <m:t>1</m:t>
                   </m:r>
                 </m:num>
                 <m:den>
                   <m:r>
+                    <w:rPr>
+                      <w:color w:val="1F4E9C"/>
+                    </w:rPr>
                     <m:t>n</m:t>
                   </m:r>
                   <m:r>
                     <m:rPr>
                       <m:sty m:val="p"/>
                     </m:rPr>
+                    <w:rPr>
+                      <w:color w:val="1F4E9C"/>
+                    </w:rPr>
                     <m:t>+</m:t>
                   </m:r>
                   <m:r>
+                    <w:rPr>
+                      <w:color w:val="1F4E9C"/>
+                    </w:rPr>
                     <m:t>1</m:t>
                   </m:r>
                 </m:den>
@@ -3150,11 +3195,17 @@
               <m:sSub>
                 <m:e>
                   <m:r>
+                    <w:rPr>
+                      <w:color w:val="1F4E9C"/>
+                    </w:rPr>
                     <m:t>u</m:t>
                   </m:r>
                 </m:e>
                 <m:sub>
                   <m:r>
+                    <w:rPr>
+                      <w:color w:val="1F4E9C"/>
+                    </w:rPr>
                     <m:t>9</m:t>
                   </m:r>
                 </m:sub>
@@ -3163,6 +3214,9 @@
                 <m:rPr>
                   <m:sty m:val="p"/>
                 </m:rPr>
+                <w:rPr>
+                  <w:color w:val="1F4E9C"/>
+                </w:rPr>
                 <m:t>=</m:t>
               </m:r>
               <m:f>
@@ -3171,11 +3225,17 @@
                 </m:fPr>
                 <m:num>
                   <m:r>
+                    <w:rPr>
+                      <w:color w:val="1F4E9C"/>
+                    </w:rPr>
                     <m:t>19</m:t>
                   </m:r>
                 </m:num>
                 <m:den>
                   <m:r>
+                    <w:rPr>
+                      <w:color w:val="1F4E9C"/>
+                    </w:rPr>
                     <m:t>10</m:t>
                   </m:r>
                 </m:den>
@@ -3184,6 +3244,9 @@
                 <m:rPr>
                   <m:sty m:val="p"/>
                 </m:rPr>
+                <w:rPr>
+                  <w:color w:val="1F4E9C"/>
+                </w:rPr>
                 <m:t>=</m:t>
               </m:r>
               <m:r>
@@ -3264,11 +3327,17 @@
               <m:sSub>
                 <m:e>
                   <m:r>
+                    <w:rPr>
+                      <w:color w:val="1F4E9C"/>
+                    </w:rPr>
                     <m:t>u</m:t>
                   </m:r>
                 </m:e>
                 <m:sub>
                   <m:r>
+                    <w:rPr>
+                      <w:color w:val="1F4E9C"/>
+                    </w:rPr>
                     <m:t>0</m:t>
                   </m:r>
                 </m:sub>
@@ -3296,20 +3365,32 @@
               <m:sSub>
                 <m:e>
                   <m:r>
+                    <w:rPr>
+                      <w:color w:val="1F4E9C"/>
+                    </w:rPr>
                     <m:t>u</m:t>
                   </m:r>
                 </m:e>
                 <m:sub>
                   <m:r>
+                    <w:rPr>
+                      <w:color w:val="1F4E9C"/>
+                    </w:rPr>
                     <m:t>n</m:t>
                   </m:r>
                   <m:r>
                     <m:rPr>
                       <m:sty m:val="p"/>
                     </m:rPr>
+                    <w:rPr>
+                      <w:color w:val="1F4E9C"/>
+                    </w:rPr>
                     <m:t>+</m:t>
                   </m:r>
                   <m:r>
+                    <w:rPr>
+                      <w:color w:val="1F4E9C"/>
+                    </w:rPr>
                     <m:t>1</m:t>
                   </m:r>
                 </m:sub>
@@ -3318,9 +3399,15 @@
                 <m:rPr>
                   <m:sty m:val="p"/>
                 </m:rPr>
+                <w:rPr>
+                  <w:color w:val="1F4E9C"/>
+                </w:rPr>
                 <m:t>=</m:t>
               </m:r>
               <m:r>
+                <w:rPr>
+                  <w:color w:val="1F4E9C"/>
+                </w:rPr>
                 <m:t>f</m:t>
               </m:r>
               <m:d>
@@ -3334,11 +3421,17 @@
                   <m:sSub>
                     <m:e>
                       <m:r>
+                        <w:rPr>
+                          <w:color w:val="1F4E9C"/>
+                        </w:rPr>
                         <m:t>u</m:t>
                       </m:r>
                     </m:e>
                     <m:sub>
                       <m:r>
+                        <w:rPr>
+                          <w:color w:val="1F4E9C"/>
+                        </w:rPr>
                         <m:t>n</m:t>
                       </m:r>
                     </m:sub>
@@ -3368,11 +3461,17 @@
               <m:sSub>
                 <m:e>
                   <m:r>
+                    <w:rPr>
+                      <w:color w:val="1F4E9C"/>
+                    </w:rPr>
                     <m:t>u</m:t>
                   </m:r>
                 </m:e>
                 <m:sub>
                   <m:r>
+                    <w:rPr>
+                      <w:color w:val="1F4E9C"/>
+                    </w:rPr>
                     <m:t>0</m:t>
                   </m:r>
                 </m:sub>
@@ -3381,9 +3480,15 @@
                 <m:rPr>
                   <m:sty m:val="p"/>
                 </m:rPr>
+                <w:rPr>
+                  <w:color w:val="1F4E9C"/>
+                </w:rPr>
                 <m:t>=</m:t>
               </m:r>
               <m:r>
+                <w:rPr>
+                  <w:color w:val="1F4E9C"/>
+                </w:rPr>
                 <m:t>1</m:t>
               </m:r>
             </m:oMath>
@@ -3409,20 +3514,32 @@
               <m:sSub>
                 <m:e>
                   <m:r>
+                    <w:rPr>
+                      <w:color w:val="1F4E9C"/>
+                    </w:rPr>
                     <m:t>u</m:t>
                   </m:r>
                 </m:e>
                 <m:sub>
                   <m:r>
+                    <w:rPr>
+                      <w:color w:val="1F4E9C"/>
+                    </w:rPr>
                     <m:t>n</m:t>
                   </m:r>
                   <m:r>
                     <m:rPr>
                       <m:sty m:val="p"/>
                     </m:rPr>
+                    <w:rPr>
+                      <w:color w:val="1F4E9C"/>
+                    </w:rPr>
                     <m:t>+</m:t>
                   </m:r>
                   <m:r>
+                    <w:rPr>
+                      <w:color w:val="1F4E9C"/>
+                    </w:rPr>
                     <m:t>1</m:t>
                   </m:r>
                 </m:sub>
@@ -3431,19 +3548,31 @@
                 <m:rPr>
                   <m:sty m:val="p"/>
                 </m:rPr>
+                <w:rPr>
+                  <w:color w:val="1F4E9C"/>
+                </w:rPr>
                 <m:t>=</m:t>
               </m:r>
               <m:r>
+                <w:rPr>
+                  <w:color w:val="1F4E9C"/>
+                </w:rPr>
                 <m:t>2</m:t>
               </m:r>
               <m:sSub>
                 <m:e>
                   <m:r>
+                    <w:rPr>
+                      <w:color w:val="1F4E9C"/>
+                    </w:rPr>
                     <m:t>u</m:t>
                   </m:r>
                 </m:e>
                 <m:sub>
                   <m:r>
+                    <w:rPr>
+                      <w:color w:val="1F4E9C"/>
+                    </w:rPr>
                     <m:t>n</m:t>
                   </m:r>
                 </m:sub>
@@ -3452,9 +3581,15 @@
                 <m:rPr>
                   <m:sty m:val="p"/>
                 </m:rPr>
+                <w:rPr>
+                  <w:color w:val="1F4E9C"/>
+                </w:rPr>
                 <m:t>+</m:t>
               </m:r>
               <m:r>
+                <w:rPr>
+                  <w:color w:val="1F4E9C"/>
+                </w:rPr>
                 <m:t>3</m:t>
               </m:r>
             </m:oMath>
@@ -3474,11 +3609,17 @@
               <m:sSub>
                 <m:e>
                   <m:r>
+                    <w:rPr>
+                      <w:color w:val="1F4E9C"/>
+                    </w:rPr>
                     <m:t>u</m:t>
                   </m:r>
                 </m:e>
                 <m:sub>
                   <m:r>
+                    <w:rPr>
+                      <w:color w:val="1F4E9C"/>
+                    </w:rPr>
                     <m:t>1</m:t>
                   </m:r>
                 </m:sub>
@@ -3487,6 +3628,9 @@
                 <m:rPr>
                   <m:sty m:val="p"/>
                 </m:rPr>
+                <w:rPr>
+                  <w:color w:val="1F4E9C"/>
+                </w:rPr>
                 <m:t>=</m:t>
               </m:r>
               <m:r>
@@ -3518,11 +3662,17 @@
               <m:sSub>
                 <m:e>
                   <m:r>
+                    <w:rPr>
+                      <w:color w:val="1F4E9C"/>
+                    </w:rPr>
                     <m:t>u</m:t>
                   </m:r>
                 </m:e>
                 <m:sub>
                   <m:r>
+                    <w:rPr>
+                      <w:color w:val="1F4E9C"/>
+                    </w:rPr>
                     <m:t>2</m:t>
                   </m:r>
                 </m:sub>
@@ -3531,6 +3681,9 @@
                 <m:rPr>
                   <m:sty m:val="p"/>
                 </m:rPr>
+                <w:rPr>
+                  <w:color w:val="1F4E9C"/>
+                </w:rPr>
                 <m:t>=</m:t>
               </m:r>
               <m:r>
@@ -3562,11 +3715,17 @@
               <m:sSub>
                 <m:e>
                   <m:r>
+                    <w:rPr>
+                      <w:color w:val="1F4E9C"/>
+                    </w:rPr>
                     <m:t>u</m:t>
                   </m:r>
                 </m:e>
                 <m:sub>
                   <m:r>
+                    <w:rPr>
+                      <w:color w:val="1F4E9C"/>
+                    </w:rPr>
                     <m:t>3</m:t>
                   </m:r>
                 </m:sub>
@@ -3575,6 +3734,9 @@
                 <m:rPr>
                   <m:sty m:val="p"/>
                 </m:rPr>
+                <w:rPr>
+                  <w:color w:val="1F4E9C"/>
+                </w:rPr>
                 <m:t>=</m:t>
               </m:r>
               <m:r>
@@ -3823,11 +3985,17 @@
                   <m:sSub>
                     <m:e>
                       <m:r>
+                        <w:rPr>
+                          <w:color w:val="1F4E9C"/>
+                        </w:rPr>
                         <m:t>C</m:t>
                       </m:r>
                     </m:e>
                     <m:sub>
                       <m:r>
+                        <w:rPr>
+                          <w:color w:val="1F4E9C"/>
+                        </w:rPr>
                         <m:t>f</m:t>
                       </m:r>
                     </m:sub>
@@ -3863,6 +4031,9 @@
                 </m:dPr>
                 <m:e>
                   <m:r>
+                    <w:rPr>
+                      <w:color w:val="1F4E9C"/>
+                    </w:rPr>
                     <m:t>Δ</m:t>
                   </m:r>
                 </m:e>
@@ -3871,18 +4042,30 @@
                 <m:rPr>
                   <m:sty m:val="p"/>
                 </m:rPr>
+                <w:rPr>
+                  <w:color w:val="1F4E9C"/>
+                </w:rPr>
                 <m:t>:</m:t>
               </m:r>
               <m:r>
+                <w:rPr>
+                  <w:color w:val="1F4E9C"/>
+                </w:rPr>
                 <m:t>y</m:t>
               </m:r>
               <m:r>
                 <m:rPr>
                   <m:sty m:val="p"/>
                 </m:rPr>
+                <w:rPr>
+                  <w:color w:val="1F4E9C"/>
+                </w:rPr>
                 <m:t>=</m:t>
               </m:r>
               <m:r>
+                <w:rPr>
+                  <w:color w:val="1F4E9C"/>
+                </w:rPr>
                 <m:t>x</m:t>
               </m:r>
             </m:oMath>
@@ -3928,11 +4111,17 @@
               <m:sSub>
                 <m:e>
                   <m:r>
+                    <w:rPr>
+                      <w:color w:val="1F4E9C"/>
+                    </w:rPr>
                     <m:t>u</m:t>
                   </m:r>
                 </m:e>
                 <m:sub>
                   <m:r>
+                    <w:rPr>
+                      <w:color w:val="1F4E9C"/>
+                    </w:rPr>
                     <m:t>0</m:t>
                   </m:r>
                 </m:sub>
@@ -3968,11 +4157,17 @@
                   <m:sSub>
                     <m:e>
                       <m:r>
+                        <w:rPr>
+                          <w:color w:val="1F4E9C"/>
+                        </w:rPr>
                         <m:t>C</m:t>
                       </m:r>
                     </m:e>
                     <m:sub>
                       <m:r>
+                        <w:rPr>
+                          <w:color w:val="1F4E9C"/>
+                        </w:rPr>
                         <m:t>f</m:t>
                       </m:r>
                     </m:sub>
@@ -3996,11 +4191,17 @@
               <m:sSub>
                 <m:e>
                   <m:r>
+                    <w:rPr>
+                      <w:color w:val="1F4E9C"/>
+                    </w:rPr>
                     <m:t>u</m:t>
                   </m:r>
                 </m:e>
                 <m:sub>
                   <m:r>
+                    <w:rPr>
+                      <w:color w:val="1F4E9C"/>
+                    </w:rPr>
                     <m:t>1</m:t>
                   </m:r>
                 </m:sub>
@@ -4009,9 +4210,15 @@
                 <m:rPr>
                   <m:sty m:val="p"/>
                 </m:rPr>
+                <w:rPr>
+                  <w:color w:val="1F4E9C"/>
+                </w:rPr>
                 <m:t>=</m:t>
               </m:r>
               <m:r>
+                <w:rPr>
+                  <w:color w:val="1F4E9C"/>
+                </w:rPr>
                 <m:t>f</m:t>
               </m:r>
               <m:d>
@@ -4025,11 +4232,17 @@
                   <m:sSub>
                     <m:e>
                       <m:r>
+                        <w:rPr>
+                          <w:color w:val="1F4E9C"/>
+                        </w:rPr>
                         <m:t>u</m:t>
                       </m:r>
                     </m:e>
                     <m:sub>
                       <m:r>
+                        <w:rPr>
+                          <w:color w:val="1F4E9C"/>
+                        </w:rPr>
                         <m:t>0</m:t>
                       </m:r>
                     </m:sub>
@@ -4085,6 +4298,9 @@
                 </m:dPr>
                 <m:e>
                   <m:r>
+                    <w:rPr>
+                      <w:color w:val="1F4E9C"/>
+                    </w:rPr>
                     <m:t>Δ</m:t>
                   </m:r>
                 </m:e>
@@ -4112,11 +4328,17 @@
               <m:sSub>
                 <m:e>
                   <m:r>
+                    <w:rPr>
+                      <w:color w:val="1F4E9C"/>
+                    </w:rPr>
                     <m:t>u</m:t>
                   </m:r>
                 </m:e>
                 <m:sub>
                   <m:r>
+                    <w:rPr>
+                      <w:color w:val="1F4E9C"/>
+                    </w:rPr>
                     <m:t>1</m:t>
                   </m:r>
                 </m:sub>
@@ -5847,7 +6069,7 @@
                     <a:graphicData uri="http://schemas.openxmlformats.org/drawingml/2006/picture">
                       <pic:pic>
                         <pic:nvPicPr>
-                          <pic:cNvPr id="0" name="3571475ca75ebe65.png"/>
+                          <pic:cNvPr id="0" name="7f07fe95386690ad.png"/>
                           <pic:cNvPicPr/>
                         </pic:nvPicPr>
                         <pic:blipFill>
@@ -9179,20 +9401,32 @@
               <m:sSub>
                 <m:e>
                   <m:r>
+                    <w:rPr>
+                      <w:color w:val="1F4E9C"/>
+                    </w:rPr>
                     <m:t>u</m:t>
                   </m:r>
                 </m:e>
                 <m:sub>
                   <m:r>
+                    <w:rPr>
+                      <w:color w:val="1F4E9C"/>
+                    </w:rPr>
                     <m:t>n</m:t>
                   </m:r>
                   <m:r>
                     <m:rPr>
                       <m:sty m:val="p"/>
                     </m:rPr>
+                    <w:rPr>
+                      <w:color w:val="1F4E9C"/>
+                    </w:rPr>
                     <m:t>+</m:t>
                   </m:r>
                   <m:r>
+                    <w:rPr>
+                      <w:color w:val="1F4E9C"/>
+                    </w:rPr>
                     <m:t>1</m:t>
                   </m:r>
                 </m:sub>
@@ -9201,16 +9435,25 @@
                 <m:rPr>
                   <m:sty m:val="p"/>
                 </m:rPr>
+                <w:rPr>
+                  <w:color w:val="1F4E9C"/>
+                </w:rPr>
                 <m:t>=</m:t>
               </m:r>
               <m:sSub>
                 <m:e>
                   <m:r>
+                    <w:rPr>
+                      <w:color w:val="1F4E9C"/>
+                    </w:rPr>
                     <m:t>u</m:t>
                   </m:r>
                 </m:e>
                 <m:sub>
                   <m:r>
+                    <w:rPr>
+                      <w:color w:val="1F4E9C"/>
+                    </w:rPr>
                     <m:t>n</m:t>
                   </m:r>
                 </m:sub>
@@ -9219,9 +9462,15 @@
                 <m:rPr>
                   <m:sty m:val="p"/>
                 </m:rPr>
+                <w:rPr>
+                  <w:color w:val="1F4E9C"/>
+                </w:rPr>
                 <m:t>+</m:t>
               </m:r>
               <m:r>
+                <w:rPr>
+                  <w:color w:val="1F4E9C"/>
+                </w:rPr>
                 <m:t>r</m:t>
               </m:r>
             </m:oMath>
@@ -9247,11 +9496,17 @@
               <m:sSub>
                 <m:e>
                   <m:r>
+                    <w:rPr>
+                      <w:color w:val="1F4E9C"/>
+                    </w:rPr>
                     <m:t>u</m:t>
                   </m:r>
                 </m:e>
                 <m:sub>
                   <m:r>
+                    <w:rPr>
+                      <w:color w:val="1F4E9C"/>
+                    </w:rPr>
                     <m:t>n</m:t>
                   </m:r>
                 </m:sub>
@@ -9260,16 +9515,25 @@
                 <m:rPr>
                   <m:sty m:val="p"/>
                 </m:rPr>
+                <w:rPr>
+                  <w:color w:val="1F4E9C"/>
+                </w:rPr>
                 <m:t>=</m:t>
               </m:r>
               <m:sSub>
                 <m:e>
                   <m:r>
+                    <w:rPr>
+                      <w:color w:val="1F4E9C"/>
+                    </w:rPr>
                     <m:t>u</m:t>
                   </m:r>
                 </m:e>
                 <m:sub>
                   <m:r>
+                    <w:rPr>
+                      <w:color w:val="1F4E9C"/>
+                    </w:rPr>
                     <m:t>0</m:t>
                   </m:r>
                 </m:sub>
@@ -9278,12 +9542,21 @@
                 <m:rPr>
                   <m:sty m:val="p"/>
                 </m:rPr>
+                <w:rPr>
+                  <w:color w:val="1F4E9C"/>
+                </w:rPr>
                 <m:t>+</m:t>
               </m:r>
               <m:r>
+                <w:rPr>
+                  <w:color w:val="1F4E9C"/>
+                </w:rPr>
                 <m:t>n</m:t>
               </m:r>
               <m:r>
+                <w:rPr>
+                  <w:color w:val="1F4E9C"/>
+                </w:rPr>
                 <m:t>r</m:t>
               </m:r>
             </m:oMath>
@@ -9309,11 +9582,17 @@
               <m:sSub>
                 <m:e>
                   <m:r>
+                    <w:rPr>
+                      <w:color w:val="1F4E9C"/>
+                    </w:rPr>
                     <m:t>u</m:t>
                   </m:r>
                 </m:e>
                 <m:sub>
                   <m:r>
+                    <w:rPr>
+                      <w:color w:val="1F4E9C"/>
+                    </w:rPr>
                     <m:t>n</m:t>
                   </m:r>
                 </m:sub>
@@ -9322,16 +9601,25 @@
                 <m:rPr>
                   <m:sty m:val="p"/>
                 </m:rPr>
+                <w:rPr>
+                  <w:color w:val="1F4E9C"/>
+                </w:rPr>
                 <m:t>=</m:t>
               </m:r>
               <m:sSub>
                 <m:e>
                   <m:r>
+                    <w:rPr>
+                      <w:color w:val="1F4E9C"/>
+                    </w:rPr>
                     <m:t>u</m:t>
                   </m:r>
                 </m:e>
                 <m:sub>
                   <m:r>
+                    <w:rPr>
+                      <w:color w:val="1F4E9C"/>
+                    </w:rPr>
                     <m:t>p</m:t>
                   </m:r>
                 </m:sub>
@@ -9340,6 +9628,9 @@
                 <m:rPr>
                   <m:sty m:val="p"/>
                 </m:rPr>
+                <w:rPr>
+                  <w:color w:val="1F4E9C"/>
+                </w:rPr>
                 <m:t>+</m:t>
               </m:r>
               <m:d>
@@ -9351,20 +9642,32 @@
                 </m:dPr>
                 <m:e>
                   <m:r>
+                    <w:rPr>
+                      <w:color w:val="1F4E9C"/>
+                    </w:rPr>
                     <m:t>n</m:t>
                   </m:r>
                   <m:r>
                     <m:rPr>
                       <m:sty m:val="p"/>
                     </m:rPr>
+                    <w:rPr>
+                      <w:color w:val="1F4E9C"/>
+                    </w:rPr>
                     <m:t>−</m:t>
                   </m:r>
                   <m:r>
+                    <w:rPr>
+                      <w:color w:val="1F4E9C"/>
+                    </w:rPr>
                     <m:t>p</m:t>
                   </m:r>
                 </m:e>
               </m:d>
               <m:r>
+                <w:rPr>
+                  <w:color w:val="1F4E9C"/>
+                </w:rPr>
                 <m:t>r</m:t>
               </m:r>
             </m:oMath>
@@ -9488,6 +9791,9 @@
             </w:r>
             <m:oMath>
               <m:r>
+                <w:rPr>
+                  <w:color w:val="1F4E9C"/>
+                </w:rPr>
                 <m:t>N</m:t>
               </m:r>
             </m:oMath>
@@ -9511,6 +9817,9 @@
             </w:r>
             <m:oMath>
               <m:r>
+                <w:rPr>
+                  <w:color w:val="1F4E9C"/>
+                </w:rPr>
                 <m:t>P</m:t>
               </m:r>
             </m:oMath>
@@ -9534,6 +9843,9 @@
             </w:r>
             <m:oMath>
               <m:r>
+                <w:rPr>
+                  <w:color w:val="1F4E9C"/>
+                </w:rPr>
                 <m:t>L</m:t>
               </m:r>
             </m:oMath>
@@ -9571,6 +9883,9 @@
             </w:r>
             <m:oMath>
               <m:r>
+                <w:rPr>
+                  <w:color w:val="1F4E9C"/>
+                </w:rPr>
                 <m:t>a</m:t>
               </m:r>
             </m:oMath>
@@ -9594,6 +9909,9 @@
             </w:r>
             <m:oMath>
               <m:r>
+                <w:rPr>
+                  <w:color w:val="1F4E9C"/>
+                </w:rPr>
                 <m:t>b</m:t>
               </m:r>
             </m:oMath>
@@ -9617,6 +9935,9 @@
             </w:r>
             <m:oMath>
               <m:r>
+                <w:rPr>
+                  <w:color w:val="1F4E9C"/>
+                </w:rPr>
                 <m:t>c</m:t>
               </m:r>
             </m:oMath>
@@ -9643,30 +9964,51 @@
                 <m:rPr>
                   <m:sty m:val="p"/>
                 </m:rPr>
+                <w:rPr>
+                  <w:color w:val="1F4E9C"/>
+                </w:rPr>
                 <m:t>⇔</m:t>
               </m:r>
               <m:r>
+                <w:rPr>
+                  <w:color w:val="1F4E9C"/>
+                </w:rPr>
                 <m:t>2</m:t>
               </m:r>
               <m:r>
+                <w:rPr>
+                  <w:color w:val="1F4E9C"/>
+                </w:rPr>
                 <m:t>b</m:t>
               </m:r>
               <m:r>
                 <m:rPr>
                   <m:sty m:val="p"/>
                 </m:rPr>
+                <w:rPr>
+                  <w:color w:val="1F4E9C"/>
+                </w:rPr>
                 <m:t>=</m:t>
               </m:r>
               <m:r>
+                <w:rPr>
+                  <w:color w:val="1F4E9C"/>
+                </w:rPr>
                 <m:t>a</m:t>
               </m:r>
               <m:r>
                 <m:rPr>
                   <m:sty m:val="p"/>
                 </m:rPr>
+                <w:rPr>
+                  <w:color w:val="1F4E9C"/>
+                </w:rPr>
                 <m:t>+</m:t>
               </m:r>
               <m:r>
+                <w:rPr>
+                  <w:color w:val="1F4E9C"/>
+                </w:rPr>
                 <m:t>c</m:t>
               </m:r>
             </m:oMath>
@@ -9798,20 +10140,32 @@
               <m:sSub>
                 <m:e>
                   <m:r>
+                    <w:rPr>
+                      <w:color w:val="1F4E9C"/>
+                    </w:rPr>
                     <m:t>u</m:t>
                   </m:r>
                 </m:e>
                 <m:sub>
                   <m:r>
+                    <w:rPr>
+                      <w:color w:val="1F4E9C"/>
+                    </w:rPr>
                     <m:t>n</m:t>
                   </m:r>
                   <m:r>
                     <m:rPr>
                       <m:sty m:val="p"/>
                     </m:rPr>
+                    <w:rPr>
+                      <w:color w:val="1F4E9C"/>
+                    </w:rPr>
                     <m:t>+</m:t>
                   </m:r>
                   <m:r>
+                    <w:rPr>
+                      <w:color w:val="1F4E9C"/>
+                    </w:rPr>
                     <m:t>1</m:t>
                   </m:r>
                 </m:sub>
@@ -9820,22 +10174,37 @@
                 <m:rPr>
                   <m:sty m:val="p"/>
                 </m:rPr>
+                <w:rPr>
+                  <w:color w:val="1F4E9C"/>
+                </w:rPr>
                 <m:t>=</m:t>
               </m:r>
               <m:r>
+                <w:rPr>
+                  <w:color w:val="1F4E9C"/>
+                </w:rPr>
                 <m:t>q</m:t>
               </m:r>
               <m:r>
+                <w:rPr>
+                  <w:color w:val="1F4E9C"/>
+                </w:rPr>
                 <m:t> </m:t>
               </m:r>
               <m:sSub>
                 <m:e>
                   <m:r>
+                    <w:rPr>
+                      <w:color w:val="1F4E9C"/>
+                    </w:rPr>
                     <m:t>u</m:t>
                   </m:r>
                 </m:e>
                 <m:sub>
                   <m:r>
+                    <w:rPr>
+                      <w:color w:val="1F4E9C"/>
+                    </w:rPr>
                     <m:t>n</m:t>
                   </m:r>
                 </m:sub>
@@ -9863,11 +10232,17 @@
               <m:sSub>
                 <m:e>
                   <m:r>
+                    <w:rPr>
+                      <w:color w:val="1F4E9C"/>
+                    </w:rPr>
                     <m:t>u</m:t>
                   </m:r>
                 </m:e>
                 <m:sub>
                   <m:r>
+                    <w:rPr>
+                      <w:color w:val="1F4E9C"/>
+                    </w:rPr>
                     <m:t>n</m:t>
                   </m:r>
                 </m:sub>
@@ -9876,16 +10251,25 @@
                 <m:rPr>
                   <m:sty m:val="p"/>
                 </m:rPr>
+                <w:rPr>
+                  <w:color w:val="1F4E9C"/>
+                </w:rPr>
                 <m:t>=</m:t>
               </m:r>
               <m:sSub>
                 <m:e>
                   <m:r>
+                    <w:rPr>
+                      <w:color w:val="1F4E9C"/>
+                    </w:rPr>
                     <m:t>u</m:t>
                   </m:r>
                 </m:e>
                 <m:sub>
                   <m:r>
+                    <w:rPr>
+                      <w:color w:val="1F4E9C"/>
+                    </w:rPr>
                     <m:t>0</m:t>
                   </m:r>
                 </m:sub>
@@ -9893,11 +10277,17 @@
               <m:sSup>
                 <m:e>
                   <m:r>
+                    <w:rPr>
+                      <w:color w:val="1F4E9C"/>
+                    </w:rPr>
                     <m:t>q</m:t>
                   </m:r>
                 </m:e>
                 <m:sup>
                   <m:r>
+                    <w:rPr>
+                      <w:color w:val="1F4E9C"/>
+                    </w:rPr>
                     <m:t>n</m:t>
                   </m:r>
                 </m:sup>
@@ -9925,11 +10315,17 @@
               <m:sSub>
                 <m:e>
                   <m:r>
+                    <w:rPr>
+                      <w:color w:val="1F4E9C"/>
+                    </w:rPr>
                     <m:t>u</m:t>
                   </m:r>
                 </m:e>
                 <m:sub>
                   <m:r>
+                    <w:rPr>
+                      <w:color w:val="1F4E9C"/>
+                    </w:rPr>
                     <m:t>n</m:t>
                   </m:r>
                 </m:sub>
@@ -9938,16 +10334,25 @@
                 <m:rPr>
                   <m:sty m:val="p"/>
                 </m:rPr>
+                <w:rPr>
+                  <w:color w:val="1F4E9C"/>
+                </w:rPr>
                 <m:t>=</m:t>
               </m:r>
               <m:sSub>
                 <m:e>
                   <m:r>
+                    <w:rPr>
+                      <w:color w:val="1F4E9C"/>
+                    </w:rPr>
                     <m:t>u</m:t>
                   </m:r>
                 </m:e>
                 <m:sub>
                   <m:r>
+                    <w:rPr>
+                      <w:color w:val="1F4E9C"/>
+                    </w:rPr>
                     <m:t>p</m:t>
                   </m:r>
                 </m:sub>
@@ -9955,23 +10360,38 @@
               <m:sSup>
                 <m:e>
                   <m:r>
+                    <w:rPr>
+                      <w:color w:val="1F4E9C"/>
+                    </w:rPr>
                     <m:t>q</m:t>
                   </m:r>
                 </m:e>
                 <m:sup>
                   <m:r>
+                    <w:rPr>
+                      <w:color w:val="1F4E9C"/>
+                    </w:rPr>
                     <m:t> </m:t>
                   </m:r>
                   <m:r>
+                    <w:rPr>
+                      <w:color w:val="1F4E9C"/>
+                    </w:rPr>
                     <m:t>n</m:t>
                   </m:r>
                   <m:r>
                     <m:rPr>
                       <m:sty m:val="p"/>
                     </m:rPr>
+                    <w:rPr>
+                      <w:color w:val="1F4E9C"/>
+                    </w:rPr>
                     <m:t>−</m:t>
                   </m:r>
                   <m:r>
+                    <w:rPr>
+                      <w:color w:val="1F4E9C"/>
+                    </w:rPr>
                     <m:t>p</m:t>
                   </m:r>
                 </m:sup>
@@ -10011,15 +10431,24 @@
             </w:r>
             <m:oMath>
               <m:r>
+                <w:rPr>
+                  <w:color w:val="1F4E9C"/>
+                </w:rPr>
                 <m:t>q</m:t>
               </m:r>
               <m:r>
                 <m:rPr>
                   <m:sty m:val="p"/>
                 </m:rPr>
+                <w:rPr>
+                  <w:color w:val="1F4E9C"/>
+                </w:rPr>
                 <m:t>≠</m:t>
               </m:r>
               <m:r>
+                <w:rPr>
+                  <w:color w:val="1F4E9C"/>
+                </w:rPr>
                 <m:t>1</m:t>
               </m:r>
             </m:oMath>
@@ -10144,6 +10573,9 @@
             </w:r>
             <m:oMath>
               <m:r>
+                <w:rPr>
+                  <w:color w:val="1F4E9C"/>
+                </w:rPr>
                 <m:t>P</m:t>
               </m:r>
             </m:oMath>
@@ -10167,6 +10599,9 @@
             </w:r>
             <m:oMath>
               <m:r>
+                <w:rPr>
+                  <w:color w:val="1F4E9C"/>
+                </w:rPr>
                 <m:t>N</m:t>
               </m:r>
             </m:oMath>
@@ -10204,6 +10639,9 @@
             </w:r>
             <m:oMath>
               <m:r>
+                <w:rPr>
+                  <w:color w:val="1F4E9C"/>
+                </w:rPr>
                 <m:t>a</m:t>
               </m:r>
             </m:oMath>
@@ -10227,6 +10665,9 @@
             </w:r>
             <m:oMath>
               <m:r>
+                <w:rPr>
+                  <w:color w:val="1F4E9C"/>
+                </w:rPr>
                 <m:t>b</m:t>
               </m:r>
             </m:oMath>
@@ -10250,6 +10691,9 @@
             </w:r>
             <m:oMath>
               <m:r>
+                <w:rPr>
+                  <w:color w:val="1F4E9C"/>
+                </w:rPr>
                 <m:t>c</m:t>
               </m:r>
             </m:oMath>
@@ -10276,16 +10720,25 @@
                 <m:rPr>
                   <m:sty m:val="p"/>
                 </m:rPr>
+                <w:rPr>
+                  <w:color w:val="1F4E9C"/>
+                </w:rPr>
                 <m:t>⇔</m:t>
               </m:r>
               <m:sSup>
                 <m:e>
                   <m:r>
+                    <w:rPr>
+                      <w:color w:val="1F4E9C"/>
+                    </w:rPr>
                     <m:t>b</m:t>
                   </m:r>
                 </m:e>
                 <m:sup>
                   <m:r>
+                    <w:rPr>
+                      <w:color w:val="1F4E9C"/>
+                    </w:rPr>
                     <m:t>2</m:t>
                   </m:r>
                 </m:sup>
@@ -10294,12 +10747,21 @@
                 <m:rPr>
                   <m:sty m:val="p"/>
                 </m:rPr>
+                <w:rPr>
+                  <w:color w:val="1F4E9C"/>
+                </w:rPr>
                 <m:t>=</m:t>
               </m:r>
               <m:r>
+                <w:rPr>
+                  <w:color w:val="1F4E9C"/>
+                </w:rPr>
                 <m:t>a</m:t>
               </m:r>
               <m:r>
+                <w:rPr>
+                  <w:color w:val="1F4E9C"/>
+                </w:rPr>
                 <m:t>c</m:t>
               </m:r>
             </m:oMath>
@@ -11808,27 +12270,45 @@
             </w:r>
             <m:oMath>
               <m:r>
+                <w:rPr>
+                  <w:color w:val="1F4E9C"/>
+                </w:rPr>
                 <m:t>α</m:t>
               </m:r>
               <m:r>
                 <m:rPr>
                   <m:sty m:val="p"/>
                 </m:rPr>
+                <w:rPr>
+                  <w:color w:val="1F4E9C"/>
+                </w:rPr>
                 <m:t>=</m:t>
               </m:r>
               <m:r>
+                <w:rPr>
+                  <w:color w:val="1F4E9C"/>
+                </w:rPr>
                 <m:t>a</m:t>
               </m:r>
               <m:r>
+                <w:rPr>
+                  <w:color w:val="1F4E9C"/>
+                </w:rPr>
                 <m:t>α</m:t>
               </m:r>
               <m:r>
                 <m:rPr>
                   <m:sty m:val="p"/>
                 </m:rPr>
+                <w:rPr>
+                  <w:color w:val="1F4E9C"/>
+                </w:rPr>
                 <m:t>+</m:t>
               </m:r>
               <m:r>
+                <w:rPr>
+                  <w:color w:val="1F4E9C"/>
+                </w:rPr>
                 <m:t>b</m:t>
               </m:r>
             </m:oMath>
@@ -11939,11 +12419,17 @@
               <m:sSub>
                 <m:e>
                   <m:r>
+                    <w:rPr>
+                      <w:color w:val="1F4E9C"/>
+                    </w:rPr>
                     <m:t>v</m:t>
                   </m:r>
                 </m:e>
                 <m:sub>
                   <m:r>
+                    <w:rPr>
+                      <w:color w:val="1F4E9C"/>
+                    </w:rPr>
                     <m:t>n</m:t>
                   </m:r>
                 </m:sub>
@@ -11952,16 +12438,25 @@
                 <m:rPr>
                   <m:sty m:val="p"/>
                 </m:rPr>
+                <w:rPr>
+                  <w:color w:val="1F4E9C"/>
+                </w:rPr>
                 <m:t>=</m:t>
               </m:r>
               <m:sSub>
                 <m:e>
                   <m:r>
+                    <w:rPr>
+                      <w:color w:val="1F4E9C"/>
+                    </w:rPr>
                     <m:t>u</m:t>
                   </m:r>
                 </m:e>
                 <m:sub>
                   <m:r>
+                    <w:rPr>
+                      <w:color w:val="1F4E9C"/>
+                    </w:rPr>
                     <m:t>n</m:t>
                   </m:r>
                 </m:sub>
@@ -11970,9 +12465,15 @@
                 <m:rPr>
                   <m:sty m:val="p"/>
                 </m:rPr>
+                <w:rPr>
+                  <w:color w:val="1F4E9C"/>
+                </w:rPr>
                 <m:t>−</m:t>
               </m:r>
               <m:r>
+                <w:rPr>
+                  <w:color w:val="1F4E9C"/>
+                </w:rPr>
                 <m:t>α</m:t>
               </m:r>
             </m:oMath>
@@ -11992,20 +12493,32 @@
               <m:sSub>
                 <m:e>
                   <m:r>
+                    <w:rPr>
+                      <w:color w:val="1F4E9C"/>
+                    </w:rPr>
                     <m:t>v</m:t>
                   </m:r>
                 </m:e>
                 <m:sub>
                   <m:r>
+                    <w:rPr>
+                      <w:color w:val="1F4E9C"/>
+                    </w:rPr>
                     <m:t>n</m:t>
                   </m:r>
                   <m:r>
                     <m:rPr>
                       <m:sty m:val="p"/>
                     </m:rPr>
+                    <w:rPr>
+                      <w:color w:val="1F4E9C"/>
+                    </w:rPr>
                     <m:t>+</m:t>
                   </m:r>
                   <m:r>
+                    <w:rPr>
+                      <w:color w:val="1F4E9C"/>
+                    </w:rPr>
                     <m:t>1</m:t>
                   </m:r>
                 </m:sub>
@@ -12014,19 +12527,31 @@
                 <m:rPr>
                   <m:sty m:val="p"/>
                 </m:rPr>
+                <w:rPr>
+                  <w:color w:val="1F4E9C"/>
+                </w:rPr>
                 <m:t>=</m:t>
               </m:r>
               <m:r>
+                <w:rPr>
+                  <w:color w:val="1F4E9C"/>
+                </w:rPr>
                 <m:t>a</m:t>
               </m:r>
               <m:sSub>
                 <m:e>
                   <m:r>
+                    <w:rPr>
+                      <w:color w:val="1F4E9C"/>
+                    </w:rPr>
                     <m:t>u</m:t>
                   </m:r>
                 </m:e>
                 <m:sub>
                   <m:r>
+                    <w:rPr>
+                      <w:color w:val="1F4E9C"/>
+                    </w:rPr>
                     <m:t>n</m:t>
                   </m:r>
                 </m:sub>
@@ -12035,27 +12560,45 @@
                 <m:rPr>
                   <m:sty m:val="p"/>
                 </m:rPr>
+                <w:rPr>
+                  <w:color w:val="1F4E9C"/>
+                </w:rPr>
                 <m:t>+</m:t>
               </m:r>
               <m:r>
+                <w:rPr>
+                  <w:color w:val="1F4E9C"/>
+                </w:rPr>
                 <m:t>b</m:t>
               </m:r>
               <m:r>
                 <m:rPr>
                   <m:sty m:val="p"/>
                 </m:rPr>
+                <w:rPr>
+                  <w:color w:val="1F4E9C"/>
+                </w:rPr>
                 <m:t>−</m:t>
               </m:r>
               <m:r>
+                <w:rPr>
+                  <w:color w:val="1F4E9C"/>
+                </w:rPr>
                 <m:t>α</m:t>
               </m:r>
               <m:r>
                 <m:rPr>
                   <m:sty m:val="p"/>
                 </m:rPr>
+                <w:rPr>
+                  <w:color w:val="1F4E9C"/>
+                </w:rPr>
                 <m:t>=</m:t>
               </m:r>
               <m:r>
+                <w:rPr>
+                  <w:color w:val="1F4E9C"/>
+                </w:rPr>
                 <m:t>a</m:t>
               </m:r>
               <m:d>
@@ -12069,11 +12612,17 @@
                   <m:sSub>
                     <m:e>
                       <m:r>
+                        <w:rPr>
+                          <w:color w:val="1F4E9C"/>
+                        </w:rPr>
                         <m:t>u</m:t>
                       </m:r>
                     </m:e>
                     <m:sub>
                       <m:r>
+                        <w:rPr>
+                          <w:color w:val="1F4E9C"/>
+                        </w:rPr>
                         <m:t>n</m:t>
                       </m:r>
                     </m:sub>
@@ -12082,9 +12631,15 @@
                     <m:rPr>
                       <m:sty m:val="p"/>
                     </m:rPr>
+                    <w:rPr>
+                      <w:color w:val="1F4E9C"/>
+                    </w:rPr>
                     <m:t>−</m:t>
                   </m:r>
                   <m:r>
+                    <w:rPr>
+                      <w:color w:val="1F4E9C"/>
+                    </w:rPr>
                     <m:t>α</m:t>
                   </m:r>
                 </m:e>
@@ -12093,6 +12648,9 @@
                 <m:rPr>
                   <m:sty m:val="p"/>
                 </m:rPr>
+                <w:rPr>
+                  <w:color w:val="1F4E9C"/>
+                </w:rPr>
                 <m:t>=</m:t>
               </m:r>
               <m:r>
@@ -12162,11 +12720,17 @@
               <m:sSub>
                 <m:e>
                   <m:r>
+                    <w:rPr>
+                      <w:color w:val="1F4E9C"/>
+                    </w:rPr>
                     <m:t>v</m:t>
                   </m:r>
                 </m:e>
                 <m:sub>
                   <m:r>
+                    <w:rPr>
+                      <w:color w:val="1F4E9C"/>
+                    </w:rPr>
                     <m:t>n</m:t>
                   </m:r>
                 </m:sub>
@@ -12175,16 +12739,25 @@
                 <m:rPr>
                   <m:sty m:val="p"/>
                 </m:rPr>
+                <w:rPr>
+                  <w:color w:val="1F4E9C"/>
+                </w:rPr>
                 <m:t>=</m:t>
               </m:r>
               <m:sSub>
                 <m:e>
                   <m:r>
+                    <w:rPr>
+                      <w:color w:val="1F4E9C"/>
+                    </w:rPr>
                     <m:t>v</m:t>
                   </m:r>
                 </m:e>
                 <m:sub>
                   <m:r>
+                    <w:rPr>
+                      <w:color w:val="1F4E9C"/>
+                    </w:rPr>
                     <m:t>0</m:t>
                   </m:r>
                 </m:sub>
@@ -12192,11 +12765,17 @@
               <m:sSup>
                 <m:e>
                   <m:r>
+                    <w:rPr>
+                      <w:color w:val="1F4E9C"/>
+                    </w:rPr>
                     <m:t>a</m:t>
                   </m:r>
                 </m:e>
                 <m:sup>
                   <m:r>
+                    <w:rPr>
+                      <w:color w:val="1F4E9C"/>
+                    </w:rPr>
                     <m:t>n</m:t>
                   </m:r>
                 </m:sup>
@@ -15647,6 +16226,9 @@
             </w:r>
             <m:oMath>
               <m:r>
+                <w:rPr>
+                  <w:color w:val="1F4E9C"/>
+                </w:rPr>
                 <m:t>P</m:t>
               </m:r>
               <m:d>
@@ -15658,6 +16240,9 @@
                 </m:dPr>
                 <m:e>
                   <m:r>
+                    <w:rPr>
+                      <w:color w:val="1F4E9C"/>
+                    </w:rPr>
                     <m:t>n</m:t>
                   </m:r>
                 </m:e>
@@ -15683,6 +16268,9 @@
             </w:r>
             <m:oMath>
               <m:r>
+                <w:rPr>
+                  <w:color w:val="1F4E9C"/>
+                </w:rPr>
                 <m:t>n</m:t>
               </m:r>
             </m:oMath>
@@ -15708,11 +16296,17 @@
               <m:sSub>
                 <m:e>
                   <m:r>
+                    <w:rPr>
+                      <w:color w:val="1F4E9C"/>
+                    </w:rPr>
                     <m:t>n</m:t>
                   </m:r>
                 </m:e>
                 <m:sub>
                   <m:r>
+                    <w:rPr>
+                      <w:color w:val="1F4E9C"/>
+                    </w:rPr>
                     <m:t>0</m:t>
                   </m:r>
                 </m:sub>
@@ -15766,6 +16360,9 @@
             </w:r>
             <m:oMath>
               <m:r>
+                <w:rPr>
+                  <w:color w:val="1F4E9C"/>
+                </w:rPr>
                 <m:t>P</m:t>
               </m:r>
               <m:d>
@@ -15779,11 +16376,17 @@
                   <m:sSub>
                     <m:e>
                       <m:r>
+                        <w:rPr>
+                          <w:color w:val="1F4E9C"/>
+                        </w:rPr>
                         <m:t>n</m:t>
                       </m:r>
                     </m:e>
                     <m:sub>
                       <m:r>
+                        <w:rPr>
+                          <w:color w:val="1F4E9C"/>
+                        </w:rPr>
                         <m:t>0</m:t>
                       </m:r>
                     </m:sub>
@@ -15851,22 +16454,34 @@
             </w:r>
             <m:oMath>
               <m:r>
+                <w:rPr>
+                  <w:color w:val="1F4E9C"/>
+                </w:rPr>
                 <m:t>n</m:t>
               </m:r>
               <m:r>
                 <m:rPr>
                   <m:sty m:val="p"/>
                 </m:rPr>
+                <w:rPr>
+                  <w:color w:val="1F4E9C"/>
+                </w:rPr>
                 <m:t>≥</m:t>
               </m:r>
               <m:sSub>
                 <m:e>
                   <m:r>
+                    <w:rPr>
+                      <w:color w:val="1F4E9C"/>
+                    </w:rPr>
                     <m:t>n</m:t>
                   </m:r>
                 </m:e>
                 <m:sub>
                   <m:r>
+                    <w:rPr>
+                      <w:color w:val="1F4E9C"/>
+                    </w:rPr>
                     <m:t>0</m:t>
                   </m:r>
                 </m:sub>
@@ -15892,6 +16507,9 @@
             </w:r>
             <m:oMath>
               <m:r>
+                <w:rPr>
+                  <w:color w:val="1F4E9C"/>
+                </w:rPr>
                 <m:t>P</m:t>
               </m:r>
               <m:d>
@@ -15903,6 +16521,9 @@
                 </m:dPr>
                 <m:e>
                   <m:r>
+                    <w:rPr>
+                      <w:color w:val="1F4E9C"/>
+                    </w:rPr>
                     <m:t>n</m:t>
                   </m:r>
                 </m:e>
@@ -15928,6 +16549,9 @@
             </w:r>
             <m:oMath>
               <m:r>
+                <w:rPr>
+                  <w:color w:val="1F4E9C"/>
+                </w:rPr>
                 <m:t>P</m:t>
               </m:r>
               <m:d>
@@ -15939,15 +16563,24 @@
                 </m:dPr>
                 <m:e>
                   <m:r>
+                    <w:rPr>
+                      <w:color w:val="1F4E9C"/>
+                    </w:rPr>
                     <m:t>n</m:t>
                   </m:r>
                   <m:r>
                     <m:rPr>
                       <m:sty m:val="p"/>
                     </m:rPr>
+                    <w:rPr>
+                      <w:color w:val="1F4E9C"/>
+                    </w:rPr>
                     <m:t>+</m:t>
                   </m:r>
                   <m:r>
+                    <w:rPr>
+                      <w:color w:val="1F4E9C"/>
+                    </w:rPr>
                     <m:t>1</m:t>
                   </m:r>
                 </m:e>
@@ -16027,22 +16660,34 @@
             </w:r>
             <m:oMath>
               <m:r>
+                <w:rPr>
+                  <w:color w:val="1F4E9C"/>
+                </w:rPr>
                 <m:t>n</m:t>
               </m:r>
               <m:r>
                 <m:rPr>
                   <m:sty m:val="p"/>
                 </m:rPr>
+                <w:rPr>
+                  <w:color w:val="1F4E9C"/>
+                </w:rPr>
                 <m:t>≥</m:t>
               </m:r>
               <m:sSub>
                 <m:e>
                   <m:r>
+                    <w:rPr>
+                      <w:color w:val="1F4E9C"/>
+                    </w:rPr>
                     <m:t>n</m:t>
                   </m:r>
                 </m:e>
                 <m:sub>
                   <m:r>
+                    <w:rPr>
+                      <w:color w:val="1F4E9C"/>
+                    </w:rPr>
                     <m:t>0</m:t>
                   </m:r>
                 </m:sub>
@@ -21306,11 +21951,17 @@
                   <m:sSub>
                     <m:e>
                       <m:r>
+                        <w:rPr>
+                          <w:color w:val="1F4E9C"/>
+                        </w:rPr>
                         <m:t>u</m:t>
                       </m:r>
                     </m:e>
                     <m:sub>
                       <m:r>
+                        <w:rPr>
+                          <w:color w:val="1F4E9C"/>
+                        </w:rPr>
                         <m:t>n</m:t>
                       </m:r>
                     </m:sub>
@@ -21352,6 +22003,9 @@
             </w:r>
             <m:oMath>
               <m:r>
+                <w:rPr>
+                  <w:color w:val="1F4E9C"/>
+                </w:rPr>
                 <m:t>M</m:t>
               </m:r>
             </m:oMath>
@@ -21377,11 +22031,17 @@
               <m:sSub>
                 <m:e>
                   <m:r>
+                    <w:rPr>
+                      <w:color w:val="1F4E9C"/>
+                    </w:rPr>
                     <m:t>u</m:t>
                   </m:r>
                 </m:e>
                 <m:sub>
                   <m:r>
+                    <w:rPr>
+                      <w:color w:val="1F4E9C"/>
+                    </w:rPr>
                     <m:t>n</m:t>
                   </m:r>
                 </m:sub>
@@ -21390,9 +22050,15 @@
                 <m:rPr>
                   <m:sty m:val="p"/>
                 </m:rPr>
+                <w:rPr>
+                  <w:color w:val="1F4E9C"/>
+                </w:rPr>
                 <m:t>≤</m:t>
               </m:r>
               <m:r>
+                <w:rPr>
+                  <w:color w:val="1F4E9C"/>
+                </w:rPr>
                 <m:t>M</m:t>
               </m:r>
             </m:oMath>
@@ -21416,6 +22082,9 @@
             </w:r>
             <m:oMath>
               <m:r>
+                <w:rPr>
+                  <w:color w:val="1F4E9C"/>
+                </w:rPr>
                 <m:t>n</m:t>
               </m:r>
             </m:oMath>
@@ -21473,6 +22142,9 @@
             </w:r>
             <m:oMath>
               <m:r>
+                <w:rPr>
+                  <w:color w:val="1F4E9C"/>
+                </w:rPr>
                 <m:t>m</m:t>
               </m:r>
             </m:oMath>
@@ -21498,11 +22170,17 @@
               <m:sSub>
                 <m:e>
                   <m:r>
+                    <w:rPr>
+                      <w:color w:val="1F4E9C"/>
+                    </w:rPr>
                     <m:t>u</m:t>
                   </m:r>
                 </m:e>
                 <m:sub>
                   <m:r>
+                    <w:rPr>
+                      <w:color w:val="1F4E9C"/>
+                    </w:rPr>
                     <m:t>n</m:t>
                   </m:r>
                 </m:sub>
@@ -21511,9 +22189,15 @@
                 <m:rPr>
                   <m:sty m:val="p"/>
                 </m:rPr>
+                <w:rPr>
+                  <w:color w:val="1F4E9C"/>
+                </w:rPr>
                 <m:t>≥</m:t>
               </m:r>
               <m:r>
+                <w:rPr>
+                  <w:color w:val="1F4E9C"/>
+                </w:rPr>
                 <m:t>m</m:t>
               </m:r>
             </m:oMath>
@@ -21537,6 +22221,9 @@
             </w:r>
             <m:oMath>
               <m:r>
+                <w:rPr>
+                  <w:color w:val="1F4E9C"/>
+                </w:rPr>
                 <m:t>n</m:t>
               </m:r>
             </m:oMath>
@@ -21726,20 +22413,32 @@
               <m:sSub>
                 <m:e>
                   <m:r>
+                    <w:rPr>
+                      <w:color w:val="1F4E9C"/>
+                    </w:rPr>
                     <m:t>u</m:t>
                   </m:r>
                 </m:e>
                 <m:sub>
                   <m:r>
+                    <w:rPr>
+                      <w:color w:val="1F4E9C"/>
+                    </w:rPr>
                     <m:t>n</m:t>
                   </m:r>
                   <m:r>
                     <m:rPr>
                       <m:sty m:val="p"/>
                     </m:rPr>
+                    <w:rPr>
+                      <w:color w:val="1F4E9C"/>
+                    </w:rPr>
                     <m:t>+</m:t>
                   </m:r>
                   <m:r>
+                    <w:rPr>
+                      <w:color w:val="1F4E9C"/>
+                    </w:rPr>
                     <m:t>1</m:t>
                   </m:r>
                 </m:sub>
@@ -21748,16 +22447,25 @@
                 <m:rPr>
                   <m:sty m:val="p"/>
                 </m:rPr>
+                <w:rPr>
+                  <w:color w:val="1F4E9C"/>
+                </w:rPr>
                 <m:t>≥</m:t>
               </m:r>
               <m:sSub>
                 <m:e>
                   <m:r>
+                    <w:rPr>
+                      <w:color w:val="1F4E9C"/>
+                    </w:rPr>
                     <m:t>u</m:t>
                   </m:r>
                 </m:e>
                 <m:sub>
                   <m:r>
+                    <w:rPr>
+                      <w:color w:val="1F4E9C"/>
+                    </w:rPr>
                     <m:t>n</m:t>
                   </m:r>
                 </m:sub>
@@ -21773,20 +22481,32 @@
               <m:sSub>
                 <m:e>
                   <m:r>
+                    <w:rPr>
+                      <w:color w:val="1F4E9C"/>
+                    </w:rPr>
                     <m:t>u</m:t>
                   </m:r>
                 </m:e>
                 <m:sub>
                   <m:r>
+                    <w:rPr>
+                      <w:color w:val="1F4E9C"/>
+                    </w:rPr>
                     <m:t>n</m:t>
                   </m:r>
                   <m:r>
                     <m:rPr>
                       <m:sty m:val="p"/>
                     </m:rPr>
+                    <w:rPr>
+                      <w:color w:val="1F4E9C"/>
+                    </w:rPr>
                     <m:t>+</m:t>
                   </m:r>
                   <m:r>
+                    <w:rPr>
+                      <w:color w:val="1F4E9C"/>
+                    </w:rPr>
                     <m:t>1</m:t>
                   </m:r>
                 </m:sub>
@@ -21795,16 +22515,25 @@
                 <m:rPr>
                   <m:sty m:val="p"/>
                 </m:rPr>
+                <w:rPr>
+                  <w:color w:val="1F4E9C"/>
+                </w:rPr>
                 <m:t>≤</m:t>
               </m:r>
               <m:sSub>
                 <m:e>
                   <m:r>
+                    <w:rPr>
+                      <w:color w:val="1F4E9C"/>
+                    </w:rPr>
                     <m:t>u</m:t>
                   </m:r>
                 </m:e>
                 <m:sub>
                   <m:r>
+                    <w:rPr>
+                      <w:color w:val="1F4E9C"/>
+                    </w:rPr>
                     <m:t>n</m:t>
                   </m:r>
                 </m:sub>
@@ -21824,6 +22553,9 @@
             </w:r>
             <m:oMath>
               <m:r>
+                <w:rPr>
+                  <w:color w:val="1F4E9C"/>
+                </w:rPr>
                 <m:t>n</m:t>
               </m:r>
             </m:oMath>
@@ -21934,20 +22666,32 @@
               <m:sSub>
                 <m:e>
                   <m:r>
+                    <w:rPr>
+                      <w:color w:val="1F4E9C"/>
+                    </w:rPr>
                     <m:t>u</m:t>
                   </m:r>
                 </m:e>
                 <m:sub>
                   <m:r>
+                    <w:rPr>
+                      <w:color w:val="1F4E9C"/>
+                    </w:rPr>
                     <m:t>n</m:t>
                   </m:r>
                   <m:r>
                     <m:rPr>
                       <m:sty m:val="p"/>
                     </m:rPr>
+                    <w:rPr>
+                      <w:color w:val="1F4E9C"/>
+                    </w:rPr>
                     <m:t>+</m:t>
                   </m:r>
                   <m:r>
+                    <w:rPr>
+                      <w:color w:val="1F4E9C"/>
+                    </w:rPr>
                     <m:t>1</m:t>
                   </m:r>
                 </m:sub>
@@ -21956,16 +22700,25 @@
                 <m:rPr>
                   <m:sty m:val="p"/>
                 </m:rPr>
+                <w:rPr>
+                  <w:color w:val="1F4E9C"/>
+                </w:rPr>
                 <m:t>−</m:t>
               </m:r>
               <m:sSub>
                 <m:e>
                   <m:r>
+                    <w:rPr>
+                      <w:color w:val="1F4E9C"/>
+                    </w:rPr>
                     <m:t>u</m:t>
                   </m:r>
                 </m:e>
                 <m:sub>
                   <m:r>
+                    <w:rPr>
+                      <w:color w:val="1F4E9C"/>
+                    </w:rPr>
                     <m:t>n</m:t>
                   </m:r>
                 </m:sub>
@@ -22018,20 +22771,32 @@
                   <m:sSub>
                     <m:e>
                       <m:r>
+                        <w:rPr>
+                          <w:color w:val="1F4E9C"/>
+                        </w:rPr>
                         <m:t>u</m:t>
                       </m:r>
                     </m:e>
                     <m:sub>
                       <m:r>
+                        <w:rPr>
+                          <w:color w:val="1F4E9C"/>
+                        </w:rPr>
                         <m:t>n</m:t>
                       </m:r>
                       <m:r>
                         <m:rPr>
                           <m:sty m:val="p"/>
                         </m:rPr>
+                        <w:rPr>
+                          <w:color w:val="1F4E9C"/>
+                        </w:rPr>
                         <m:t>+</m:t>
                       </m:r>
                       <m:r>
+                        <w:rPr>
+                          <w:color w:val="1F4E9C"/>
+                        </w:rPr>
                         <m:t>1</m:t>
                       </m:r>
                     </m:sub>
@@ -22041,11 +22806,17 @@
                   <m:sSub>
                     <m:e>
                       <m:r>
+                        <w:rPr>
+                          <w:color w:val="1F4E9C"/>
+                        </w:rPr>
                         <m:t>u</m:t>
                       </m:r>
                     </m:e>
                     <m:sub>
                       <m:r>
+                        <w:rPr>
+                          <w:color w:val="1F4E9C"/>
+                        </w:rPr>
                         <m:t>n</m:t>
                       </m:r>
                     </m:sub>
@@ -22073,6 +22844,9 @@
             </w:r>
             <m:oMath>
               <m:r>
+                <w:rPr>
+                  <w:color w:val="1F4E9C"/>
+                </w:rPr>
                 <m:t>1</m:t>
               </m:r>
             </m:oMath>
@@ -22122,6 +22896,9 @@
             </w:r>
             <m:oMath>
               <m:r>
+                <w:rPr>
+                  <w:color w:val="1F4E9C"/>
+                </w:rPr>
                 <m:t>f</m:t>
               </m:r>
             </m:oMath>
@@ -22147,11 +22924,17 @@
               <m:sSub>
                 <m:e>
                   <m:r>
+                    <w:rPr>
+                      <w:color w:val="1F4E9C"/>
+                    </w:rPr>
                     <m:t>u</m:t>
                   </m:r>
                 </m:e>
                 <m:sub>
                   <m:r>
+                    <w:rPr>
+                      <w:color w:val="1F4E9C"/>
+                    </w:rPr>
                     <m:t>n</m:t>
                   </m:r>
                 </m:sub>
@@ -22160,9 +22943,15 @@
                 <m:rPr>
                   <m:sty m:val="p"/>
                 </m:rPr>
+                <w:rPr>
+                  <w:color w:val="1F4E9C"/>
+                </w:rPr>
                 <m:t>=</m:t>
               </m:r>
               <m:r>
+                <w:rPr>
+                  <w:color w:val="1F4E9C"/>
+                </w:rPr>
                 <m:t>f</m:t>
               </m:r>
               <m:d>
@@ -22174,6 +22963,9 @@
                 </m:dPr>
                 <m:e>
                   <m:r>
+                    <w:rPr>
+                      <w:color w:val="1F4E9C"/>
+                    </w:rPr>
                     <m:t>n</m:t>
                   </m:r>
                 </m:e>
@@ -22221,20 +23013,32 @@
               <m:sSub>
                 <m:e>
                   <m:r>
+                    <w:rPr>
+                      <w:color w:val="1F4E9C"/>
+                    </w:rPr>
                     <m:t>u</m:t>
                   </m:r>
                 </m:e>
                 <m:sub>
                   <m:r>
+                    <w:rPr>
+                      <w:color w:val="1F4E9C"/>
+                    </w:rPr>
                     <m:t>n</m:t>
                   </m:r>
                   <m:r>
                     <m:rPr>
                       <m:sty m:val="p"/>
                     </m:rPr>
+                    <w:rPr>
+                      <w:color w:val="1F4E9C"/>
+                    </w:rPr>
                     <m:t>+</m:t>
                   </m:r>
                   <m:r>
+                    <w:rPr>
+                      <w:color w:val="1F4E9C"/>
+                    </w:rPr>
                     <m:t>1</m:t>
                   </m:r>
                 </m:sub>
@@ -22243,9 +23047,15 @@
                 <m:rPr>
                   <m:sty m:val="p"/>
                 </m:rPr>
+                <w:rPr>
+                  <w:color w:val="1F4E9C"/>
+                </w:rPr>
                 <m:t>=</m:t>
               </m:r>
               <m:r>
+                <w:rPr>
+                  <w:color w:val="1F4E9C"/>
+                </w:rPr>
                 <m:t>f</m:t>
               </m:r>
               <m:d>
@@ -22259,11 +23069,17 @@
                   <m:sSub>
                     <m:e>
                       <m:r>
+                        <w:rPr>
+                          <w:color w:val="1F4E9C"/>
+                        </w:rPr>
                         <m:t>u</m:t>
                       </m:r>
                     </m:e>
                     <m:sub>
                       <m:r>
+                        <w:rPr>
+                          <w:color w:val="1F4E9C"/>
+                        </w:rPr>
                         <m:t>n</m:t>
                       </m:r>
                     </m:sub>
@@ -27200,11 +28016,17 @@
                   <m:sSub>
                     <m:e>
                       <m:r>
+                        <w:rPr>
+                          <w:color w:val="1F4E9C"/>
+                        </w:rPr>
                         <m:t>u</m:t>
                       </m:r>
                     </m:e>
                     <m:sub>
                       <m:r>
+                        <w:rPr>
+                          <w:color w:val="1F4E9C"/>
+                        </w:rPr>
                         <m:t>n</m:t>
                       </m:r>
                     </m:sub>
@@ -27249,6 +28071,9 @@
                 <m:rPr>
                   <m:sty m:val="p"/>
                 </m:rPr>
+                <w:rPr>
+                  <w:color w:val="1F4E9C"/>
+                </w:rPr>
                 <m:t>ℓ</m:t>
               </m:r>
             </m:oMath>
@@ -27294,11 +28119,17 @@
               <m:sSub>
                 <m:e>
                   <m:r>
+                    <w:rPr>
+                      <w:color w:val="1F4E9C"/>
+                    </w:rPr>
                     <m:t>u</m:t>
                   </m:r>
                 </m:e>
                 <m:sub>
                   <m:r>
+                    <w:rPr>
+                      <w:color w:val="1F4E9C"/>
+                    </w:rPr>
                     <m:t>n</m:t>
                   </m:r>
                 </m:sub>
@@ -27307,9 +28138,15 @@
                 <m:rPr>
                   <m:sty m:val="p"/>
                 </m:rPr>
+                <w:rPr>
+                  <w:color w:val="1F4E9C"/>
+                </w:rPr>
                 <m:t>=</m:t>
               </m:r>
               <m:r>
+                <w:rPr>
+                  <w:color w:val="1F4E9C"/>
+                </w:rPr>
                 <m:t>f</m:t>
               </m:r>
               <m:d>
@@ -27321,6 +28158,9 @@
                 </m:dPr>
                 <m:e>
                   <m:r>
+                    <w:rPr>
+                      <w:color w:val="1F4E9C"/>
+                    </w:rPr>
                     <m:t>n</m:t>
                   </m:r>
                 </m:e>
@@ -27351,34 +28191,52 @@
                     <m:rPr>
                       <m:sty m:val="p"/>
                     </m:rPr>
+                    <w:rPr>
+                      <w:color w:val="1F4E9C"/>
+                    </w:rPr>
                     <m:t>lim</m:t>
                   </m:r>
                 </m:e>
                 <m:lim>
                   <m:r>
+                    <w:rPr>
+                      <w:color w:val="1F4E9C"/>
+                    </w:rPr>
                     <m:t>x</m:t>
                   </m:r>
                   <m:r>
                     <m:rPr>
                       <m:sty m:val="p"/>
                     </m:rPr>
+                    <w:rPr>
+                      <w:color w:val="1F4E9C"/>
+                    </w:rPr>
                     <m:t>→</m:t>
                   </m:r>
                   <m:r>
                     <m:rPr>
                       <m:sty m:val="p"/>
                     </m:rPr>
+                    <w:rPr>
+                      <w:color w:val="1F4E9C"/>
+                    </w:rPr>
                     <m:t>+</m:t>
                   </m:r>
                   <m:r>
                     <m:rPr>
                       <m:sty m:val="p"/>
                     </m:rPr>
+                    <w:rPr>
+                      <w:color w:val="1F4E9C"/>
+                    </w:rPr>
                     <m:t>∞</m:t>
                   </m:r>
                 </m:lim>
               </m:limLow>
               <m:r>
+                <w:rPr>
+                  <w:color w:val="1F4E9C"/>
+                </w:rPr>
                 <m:t>f</m:t>
               </m:r>
               <m:d>
@@ -27390,6 +28248,9 @@
                 </m:dPr>
                 <m:e>
                   <m:r>
+                    <w:rPr>
+                      <w:color w:val="1F4E9C"/>
+                    </w:rPr>
                     <m:t>x</m:t>
                   </m:r>
                 </m:e>
@@ -27398,12 +28259,18 @@
                 <m:rPr>
                   <m:sty m:val="p"/>
                 </m:rPr>
+                <w:rPr>
+                  <w:color w:val="1F4E9C"/>
+                </w:rPr>
                 <m:t>=</m:t>
               </m:r>
               <m:r>
                 <m:rPr>
                   <m:sty m:val="p"/>
                 </m:rPr>
+                <w:rPr>
+                  <w:color w:val="1F4E9C"/>
+                </w:rPr>
                 <m:t>ℓ</m:t>
               </m:r>
             </m:oMath>
@@ -27652,15 +28519,24 @@
             </w:r>
             <m:oMath>
               <m:r>
+                <w:rPr>
+                  <w:color w:val="1F4E9C"/>
+                </w:rPr>
                 <m:t>q</m:t>
               </m:r>
               <m:r>
                 <m:rPr>
                   <m:sty m:val="p"/>
                 </m:rPr>
+                <w:rPr>
+                  <w:color w:val="1F4E9C"/>
+                </w:rPr>
                 <m:t>&gt;</m:t>
               </m:r>
               <m:r>
+                <w:rPr>
+                  <w:color w:val="1F4E9C"/>
+                </w:rPr>
                 <m:t>1</m:t>
               </m:r>
             </m:oMath>
@@ -27683,29 +28559,44 @@
                     <m:rPr>
                       <m:sty m:val="p"/>
                     </m:rPr>
+                    <w:rPr>
+                      <w:color w:val="1F4E9C"/>
+                    </w:rPr>
                     <m:t>lim</m:t>
                   </m:r>
                 </m:e>
                 <m:lim>
                   <m:r>
+                    <w:rPr>
+                      <w:color w:val="1F4E9C"/>
+                    </w:rPr>
                     <m:t>n</m:t>
                   </m:r>
                   <m:r>
                     <m:rPr>
                       <m:sty m:val="p"/>
                     </m:rPr>
+                    <w:rPr>
+                      <w:color w:val="1F4E9C"/>
+                    </w:rPr>
                     <m:t>→</m:t>
                   </m:r>
                   <m:r>
                     <m:rPr>
                       <m:sty m:val="p"/>
                     </m:rPr>
+                    <w:rPr>
+                      <w:color w:val="1F4E9C"/>
+                    </w:rPr>
                     <m:t>+</m:t>
                   </m:r>
                   <m:r>
                     <m:rPr>
                       <m:sty m:val="p"/>
                     </m:rPr>
+                    <w:rPr>
+                      <w:color w:val="1F4E9C"/>
+                    </w:rPr>
                     <m:t>∞</m:t>
                   </m:r>
                 </m:lim>
@@ -27713,11 +28604,17 @@
               <m:sSup>
                 <m:e>
                   <m:r>
+                    <w:rPr>
+                      <w:color w:val="1F4E9C"/>
+                    </w:rPr>
                     <m:t>q</m:t>
                   </m:r>
                 </m:e>
                 <m:sup>
                   <m:r>
+                    <w:rPr>
+                      <w:color w:val="1F4E9C"/>
+                    </w:rPr>
                     <m:t>n</m:t>
                   </m:r>
                 </m:sup>
@@ -27726,18 +28623,27 @@
                 <m:rPr>
                   <m:sty m:val="p"/>
                 </m:rPr>
+                <w:rPr>
+                  <w:color w:val="1F4E9C"/>
+                </w:rPr>
                 <m:t>=</m:t>
               </m:r>
               <m:r>
                 <m:rPr>
                   <m:sty m:val="p"/>
                 </m:rPr>
+                <w:rPr>
+                  <w:color w:val="1F4E9C"/>
+                </w:rPr>
                 <m:t>+</m:t>
               </m:r>
               <m:r>
                 <m:rPr>
                   <m:sty m:val="p"/>
                 </m:rPr>
+                <w:rPr>
+                  <w:color w:val="1F4E9C"/>
+                </w:rPr>
                 <m:t>∞</m:t>
               </m:r>
             </m:oMath>
@@ -27761,15 +28667,24 @@
             </w:r>
             <m:oMath>
               <m:r>
+                <w:rPr>
+                  <w:color w:val="1F4E9C"/>
+                </w:rPr>
                 <m:t>q</m:t>
               </m:r>
               <m:r>
                 <m:rPr>
                   <m:sty m:val="p"/>
                 </m:rPr>
+                <w:rPr>
+                  <w:color w:val="1F4E9C"/>
+                </w:rPr>
                 <m:t>=</m:t>
               </m:r>
               <m:r>
+                <w:rPr>
+                  <w:color w:val="1F4E9C"/>
+                </w:rPr>
                 <m:t>1</m:t>
               </m:r>
             </m:oMath>
@@ -27792,29 +28707,44 @@
                     <m:rPr>
                       <m:sty m:val="p"/>
                     </m:rPr>
+                    <w:rPr>
+                      <w:color w:val="1F4E9C"/>
+                    </w:rPr>
                     <m:t>lim</m:t>
                   </m:r>
                 </m:e>
                 <m:lim>
                   <m:r>
+                    <w:rPr>
+                      <w:color w:val="1F4E9C"/>
+                    </w:rPr>
                     <m:t>n</m:t>
                   </m:r>
                   <m:r>
                     <m:rPr>
                       <m:sty m:val="p"/>
                     </m:rPr>
+                    <w:rPr>
+                      <w:color w:val="1F4E9C"/>
+                    </w:rPr>
                     <m:t>→</m:t>
                   </m:r>
                   <m:r>
                     <m:rPr>
                       <m:sty m:val="p"/>
                     </m:rPr>
+                    <w:rPr>
+                      <w:color w:val="1F4E9C"/>
+                    </w:rPr>
                     <m:t>+</m:t>
                   </m:r>
                   <m:r>
                     <m:rPr>
                       <m:sty m:val="p"/>
                     </m:rPr>
+                    <w:rPr>
+                      <w:color w:val="1F4E9C"/>
+                    </w:rPr>
                     <m:t>∞</m:t>
                   </m:r>
                 </m:lim>
@@ -27822,11 +28752,17 @@
               <m:sSup>
                 <m:e>
                   <m:r>
+                    <w:rPr>
+                      <w:color w:val="1F4E9C"/>
+                    </w:rPr>
                     <m:t>q</m:t>
                   </m:r>
                 </m:e>
                 <m:sup>
                   <m:r>
+                    <w:rPr>
+                      <w:color w:val="1F4E9C"/>
+                    </w:rPr>
                     <m:t>n</m:t>
                   </m:r>
                 </m:sup>
@@ -27835,9 +28771,15 @@
                 <m:rPr>
                   <m:sty m:val="p"/>
                 </m:rPr>
+                <w:rPr>
+                  <w:color w:val="1F4E9C"/>
+                </w:rPr>
                 <m:t>=</m:t>
               </m:r>
               <m:r>
+                <w:rPr>
+                  <w:color w:val="1F4E9C"/>
+                </w:rPr>
                 <m:t>1</m:t>
               </m:r>
             </m:oMath>
@@ -27872,27 +28814,45 @@
                 <m:rPr>
                   <m:sty m:val="p"/>
                 </m:rPr>
+                <w:rPr>
+                  <w:color w:val="1F4E9C"/>
+                </w:rPr>
                 <m:t>−</m:t>
               </m:r>
               <m:r>
+                <w:rPr>
+                  <w:color w:val="1F4E9C"/>
+                </w:rPr>
                 <m:t>1</m:t>
               </m:r>
               <m:r>
                 <m:rPr>
                   <m:sty m:val="p"/>
                 </m:rPr>
+                <w:rPr>
+                  <w:color w:val="1F4E9C"/>
+                </w:rPr>
                 <m:t>&lt;</m:t>
               </m:r>
               <m:r>
+                <w:rPr>
+                  <w:color w:val="1F4E9C"/>
+                </w:rPr>
                 <m:t>q</m:t>
               </m:r>
               <m:r>
                 <m:rPr>
                   <m:sty m:val="p"/>
                 </m:rPr>
+                <w:rPr>
+                  <w:color w:val="1F4E9C"/>
+                </w:rPr>
                 <m:t>&lt;</m:t>
               </m:r>
               <m:r>
+                <w:rPr>
+                  <w:color w:val="1F4E9C"/>
+                </w:rPr>
                 <m:t>1</m:t>
               </m:r>
             </m:oMath>
@@ -28011,21 +28971,33 @@
             </w:r>
             <m:oMath>
               <m:r>
+                <w:rPr>
+                  <w:color w:val="1F4E9C"/>
+                </w:rPr>
                 <m:t>q</m:t>
               </m:r>
               <m:r>
                 <m:rPr>
                   <m:sty m:val="p"/>
                 </m:rPr>
+                <w:rPr>
+                  <w:color w:val="1F4E9C"/>
+                </w:rPr>
                 <m:t>≤</m:t>
               </m:r>
               <m:r>
                 <m:rPr>
                   <m:sty m:val="p"/>
                 </m:rPr>
+                <w:rPr>
+                  <w:color w:val="1F4E9C"/>
+                </w:rPr>
                 <m:t>−</m:t>
               </m:r>
               <m:r>
+                <w:rPr>
+                  <w:color w:val="1F4E9C"/>
+                </w:rPr>
                 <m:t>1</m:t>
               </m:r>
             </m:oMath>
@@ -28118,11 +29090,17 @@
               <m:sSub>
                 <m:e>
                   <m:r>
+                    <w:rPr>
+                      <w:color w:val="1F4E9C"/>
+                    </w:rPr>
                     <m:t>u</m:t>
                   </m:r>
                 </m:e>
                 <m:sub>
                   <m:r>
+                    <w:rPr>
+                      <w:color w:val="1F4E9C"/>
+                    </w:rPr>
                     <m:t>n</m:t>
                   </m:r>
                 </m:sub>
@@ -28131,16 +29109,25 @@
                 <m:rPr>
                   <m:sty m:val="p"/>
                 </m:rPr>
+                <w:rPr>
+                  <w:color w:val="1F4E9C"/>
+                </w:rPr>
                 <m:t>≥</m:t>
               </m:r>
               <m:sSub>
                 <m:e>
                   <m:r>
+                    <w:rPr>
+                      <w:color w:val="1F4E9C"/>
+                    </w:rPr>
                     <m:t>v</m:t>
                   </m:r>
                 </m:e>
                 <m:sub>
                   <m:r>
+                    <w:rPr>
+                      <w:color w:val="1F4E9C"/>
+                    </w:rPr>
                     <m:t>n</m:t>
                   </m:r>
                 </m:sub>
@@ -28171,29 +29158,44 @@
                     <m:rPr>
                       <m:sty m:val="p"/>
                     </m:rPr>
+                    <w:rPr>
+                      <w:color w:val="1F4E9C"/>
+                    </w:rPr>
                     <m:t>lim</m:t>
                   </m:r>
                 </m:e>
                 <m:lim>
                   <m:r>
+                    <w:rPr>
+                      <w:color w:val="1F4E9C"/>
+                    </w:rPr>
                     <m:t>n</m:t>
                   </m:r>
                   <m:r>
                     <m:rPr>
                       <m:sty m:val="p"/>
                     </m:rPr>
+                    <w:rPr>
+                      <w:color w:val="1F4E9C"/>
+                    </w:rPr>
                     <m:t>→</m:t>
                   </m:r>
                   <m:r>
                     <m:rPr>
                       <m:sty m:val="p"/>
                     </m:rPr>
+                    <w:rPr>
+                      <w:color w:val="1F4E9C"/>
+                    </w:rPr>
                     <m:t>+</m:t>
                   </m:r>
                   <m:r>
                     <m:rPr>
                       <m:sty m:val="p"/>
                     </m:rPr>
+                    <w:rPr>
+                      <w:color w:val="1F4E9C"/>
+                    </w:rPr>
                     <m:t>∞</m:t>
                   </m:r>
                 </m:lim>
@@ -28201,11 +29203,17 @@
               <m:sSub>
                 <m:e>
                   <m:r>
+                    <w:rPr>
+                      <w:color w:val="1F4E9C"/>
+                    </w:rPr>
                     <m:t>v</m:t>
                   </m:r>
                 </m:e>
                 <m:sub>
                   <m:r>
+                    <w:rPr>
+                      <w:color w:val="1F4E9C"/>
+                    </w:rPr>
                     <m:t>n</m:t>
                   </m:r>
                 </m:sub>
@@ -28214,18 +29222,27 @@
                 <m:rPr>
                   <m:sty m:val="p"/>
                 </m:rPr>
+                <w:rPr>
+                  <w:color w:val="1F4E9C"/>
+                </w:rPr>
                 <m:t>=</m:t>
               </m:r>
               <m:r>
                 <m:rPr>
                   <m:sty m:val="p"/>
                 </m:rPr>
+                <w:rPr>
+                  <w:color w:val="1F4E9C"/>
+                </w:rPr>
                 <m:t>+</m:t>
               </m:r>
               <m:r>
                 <m:rPr>
                   <m:sty m:val="p"/>
                 </m:rPr>
+                <w:rPr>
+                  <w:color w:val="1F4E9C"/>
+                </w:rPr>
                 <m:t>∞</m:t>
               </m:r>
             </m:oMath>
@@ -28240,6 +29257,9 @@
                 <m:rPr>
                   <m:sty m:val="p"/>
                 </m:rPr>
+                <w:rPr>
+                  <w:color w:val="1F4E9C"/>
+                </w:rPr>
                 <m:t>⇒</m:t>
               </m:r>
             </m:oMath>
@@ -28256,29 +29276,44 @@
                     <m:rPr>
                       <m:sty m:val="p"/>
                     </m:rPr>
+                    <w:rPr>
+                      <w:color w:val="1F4E9C"/>
+                    </w:rPr>
                     <m:t>lim</m:t>
                   </m:r>
                 </m:e>
                 <m:lim>
                   <m:r>
+                    <w:rPr>
+                      <w:color w:val="1F4E9C"/>
+                    </w:rPr>
                     <m:t>n</m:t>
                   </m:r>
                   <m:r>
                     <m:rPr>
                       <m:sty m:val="p"/>
                     </m:rPr>
+                    <w:rPr>
+                      <w:color w:val="1F4E9C"/>
+                    </w:rPr>
                     <m:t>→</m:t>
                   </m:r>
                   <m:r>
                     <m:rPr>
                       <m:sty m:val="p"/>
                     </m:rPr>
+                    <w:rPr>
+                      <w:color w:val="1F4E9C"/>
+                    </w:rPr>
                     <m:t>+</m:t>
                   </m:r>
                   <m:r>
                     <m:rPr>
                       <m:sty m:val="p"/>
                     </m:rPr>
+                    <w:rPr>
+                      <w:color w:val="1F4E9C"/>
+                    </w:rPr>
                     <m:t>∞</m:t>
                   </m:r>
                 </m:lim>
@@ -28286,11 +29321,17 @@
               <m:sSub>
                 <m:e>
                   <m:r>
+                    <w:rPr>
+                      <w:color w:val="1F4E9C"/>
+                    </w:rPr>
                     <m:t>u</m:t>
                   </m:r>
                 </m:e>
                 <m:sub>
                   <m:r>
+                    <w:rPr>
+                      <w:color w:val="1F4E9C"/>
+                    </w:rPr>
                     <m:t>n</m:t>
                   </m:r>
                 </m:sub>
@@ -28299,18 +29340,27 @@
                 <m:rPr>
                   <m:sty m:val="p"/>
                 </m:rPr>
+                <w:rPr>
+                  <w:color w:val="1F4E9C"/>
+                </w:rPr>
                 <m:t>=</m:t>
               </m:r>
               <m:r>
                 <m:rPr>
                   <m:sty m:val="p"/>
                 </m:rPr>
+                <w:rPr>
+                  <w:color w:val="1F4E9C"/>
+                </w:rPr>
                 <m:t>+</m:t>
               </m:r>
               <m:r>
                 <m:rPr>
                   <m:sty m:val="p"/>
                 </m:rPr>
+                <w:rPr>
+                  <w:color w:val="1F4E9C"/>
+                </w:rPr>
                 <m:t>∞</m:t>
               </m:r>
             </m:oMath>
@@ -28344,11 +29394,17 @@
               <m:sSub>
                 <m:e>
                   <m:r>
+                    <w:rPr>
+                      <w:color w:val="1F4E9C"/>
+                    </w:rPr>
                     <m:t>v</m:t>
                   </m:r>
                 </m:e>
                 <m:sub>
                   <m:r>
+                    <w:rPr>
+                      <w:color w:val="1F4E9C"/>
+                    </w:rPr>
                     <m:t>n</m:t>
                   </m:r>
                 </m:sub>
@@ -28357,16 +29413,25 @@
                 <m:rPr>
                   <m:sty m:val="p"/>
                 </m:rPr>
+                <w:rPr>
+                  <w:color w:val="1F4E9C"/>
+                </w:rPr>
                 <m:t>≤</m:t>
               </m:r>
               <m:sSub>
                 <m:e>
                   <m:r>
+                    <w:rPr>
+                      <w:color w:val="1F4E9C"/>
+                    </w:rPr>
                     <m:t>u</m:t>
                   </m:r>
                 </m:e>
                 <m:sub>
                   <m:r>
+                    <w:rPr>
+                      <w:color w:val="1F4E9C"/>
+                    </w:rPr>
                     <m:t>n</m:t>
                   </m:r>
                 </m:sub>
@@ -28375,16 +29440,25 @@
                 <m:rPr>
                   <m:sty m:val="p"/>
                 </m:rPr>
+                <w:rPr>
+                  <w:color w:val="1F4E9C"/>
+                </w:rPr>
                 <m:t>≤</m:t>
               </m:r>
               <m:sSub>
                 <m:e>
                   <m:r>
+                    <w:rPr>
+                      <w:color w:val="1F4E9C"/>
+                    </w:rPr>
                     <m:t>w</m:t>
                   </m:r>
                 </m:e>
                 <m:sub>
                   <m:r>
+                    <w:rPr>
+                      <w:color w:val="1F4E9C"/>
+                    </w:rPr>
                     <m:t>n</m:t>
                   </m:r>
                 </m:sub>
@@ -28415,29 +29489,44 @@
                     <m:rPr>
                       <m:sty m:val="p"/>
                     </m:rPr>
+                    <w:rPr>
+                      <w:color w:val="1F4E9C"/>
+                    </w:rPr>
                     <m:t>lim</m:t>
                   </m:r>
                 </m:e>
                 <m:lim>
                   <m:r>
+                    <w:rPr>
+                      <w:color w:val="1F4E9C"/>
+                    </w:rPr>
                     <m:t>n</m:t>
                   </m:r>
                   <m:r>
                     <m:rPr>
                       <m:sty m:val="p"/>
                     </m:rPr>
+                    <w:rPr>
+                      <w:color w:val="1F4E9C"/>
+                    </w:rPr>
                     <m:t>→</m:t>
                   </m:r>
                   <m:r>
                     <m:rPr>
                       <m:sty m:val="p"/>
                     </m:rPr>
+                    <w:rPr>
+                      <w:color w:val="1F4E9C"/>
+                    </w:rPr>
                     <m:t>+</m:t>
                   </m:r>
                   <m:r>
                     <m:rPr>
                       <m:sty m:val="p"/>
                     </m:rPr>
+                    <w:rPr>
+                      <w:color w:val="1F4E9C"/>
+                    </w:rPr>
                     <m:t>∞</m:t>
                   </m:r>
                 </m:lim>
@@ -28445,11 +29534,17 @@
               <m:sSub>
                 <m:e>
                   <m:r>
+                    <w:rPr>
+                      <w:color w:val="1F4E9C"/>
+                    </w:rPr>
                     <m:t>v</m:t>
                   </m:r>
                 </m:e>
                 <m:sub>
                   <m:r>
+                    <w:rPr>
+                      <w:color w:val="1F4E9C"/>
+                    </w:rPr>
                     <m:t>n</m:t>
                   </m:r>
                 </m:sub>
@@ -28458,6 +29553,9 @@
                 <m:rPr>
                   <m:sty m:val="p"/>
                 </m:rPr>
+                <w:rPr>
+                  <w:color w:val="1F4E9C"/>
+                </w:rPr>
                 <m:t>=</m:t>
               </m:r>
               <m:limLow>
@@ -28466,29 +29564,44 @@
                     <m:rPr>
                       <m:sty m:val="p"/>
                     </m:rPr>
+                    <w:rPr>
+                      <w:color w:val="1F4E9C"/>
+                    </w:rPr>
                     <m:t>lim</m:t>
                   </m:r>
                 </m:e>
                 <m:lim>
                   <m:r>
+                    <w:rPr>
+                      <w:color w:val="1F4E9C"/>
+                    </w:rPr>
                     <m:t>n</m:t>
                   </m:r>
                   <m:r>
                     <m:rPr>
                       <m:sty m:val="p"/>
                     </m:rPr>
+                    <w:rPr>
+                      <w:color w:val="1F4E9C"/>
+                    </w:rPr>
                     <m:t>→</m:t>
                   </m:r>
                   <m:r>
                     <m:rPr>
                       <m:sty m:val="p"/>
                     </m:rPr>
+                    <w:rPr>
+                      <w:color w:val="1F4E9C"/>
+                    </w:rPr>
                     <m:t>+</m:t>
                   </m:r>
                   <m:r>
                     <m:rPr>
                       <m:sty m:val="p"/>
                     </m:rPr>
+                    <w:rPr>
+                      <w:color w:val="1F4E9C"/>
+                    </w:rPr>
                     <m:t>∞</m:t>
                   </m:r>
                 </m:lim>
@@ -28496,11 +29609,17 @@
               <m:sSub>
                 <m:e>
                   <m:r>
+                    <w:rPr>
+                      <w:color w:val="1F4E9C"/>
+                    </w:rPr>
                     <m:t>w</m:t>
                   </m:r>
                 </m:e>
                 <m:sub>
                   <m:r>
+                    <w:rPr>
+                      <w:color w:val="1F4E9C"/>
+                    </w:rPr>
                     <m:t>n</m:t>
                   </m:r>
                 </m:sub>
@@ -28509,12 +29628,18 @@
                 <m:rPr>
                   <m:sty m:val="p"/>
                 </m:rPr>
+                <w:rPr>
+                  <w:color w:val="1F4E9C"/>
+                </w:rPr>
                 <m:t>=</m:t>
               </m:r>
               <m:r>
                 <m:rPr>
                   <m:sty m:val="p"/>
                 </m:rPr>
+                <w:rPr>
+                  <w:color w:val="1F4E9C"/>
+                </w:rPr>
                 <m:t>ℓ</m:t>
               </m:r>
             </m:oMath>
@@ -28529,6 +29654,9 @@
                 <m:rPr>
                   <m:sty m:val="p"/>
                 </m:rPr>
+                <w:rPr>
+                  <w:color w:val="1F4E9C"/>
+                </w:rPr>
                 <m:t>⇒</m:t>
               </m:r>
             </m:oMath>
@@ -28803,20 +29931,32 @@
               <m:sSub>
                 <m:e>
                   <m:r>
+                    <w:rPr>
+                      <w:color w:val="1F4E9C"/>
+                    </w:rPr>
                     <m:t>u</m:t>
                   </m:r>
                 </m:e>
                 <m:sub>
                   <m:r>
+                    <w:rPr>
+                      <w:color w:val="1F4E9C"/>
+                    </w:rPr>
                     <m:t>n</m:t>
                   </m:r>
                   <m:r>
                     <m:rPr>
                       <m:sty m:val="p"/>
                     </m:rPr>
+                    <w:rPr>
+                      <w:color w:val="1F4E9C"/>
+                    </w:rPr>
                     <m:t>+</m:t>
                   </m:r>
                   <m:r>
+                    <w:rPr>
+                      <w:color w:val="1F4E9C"/>
+                    </w:rPr>
                     <m:t>1</m:t>
                   </m:r>
                 </m:sub>
@@ -28825,9 +29965,15 @@
                 <m:rPr>
                   <m:sty m:val="p"/>
                 </m:rPr>
+                <w:rPr>
+                  <w:color w:val="1F4E9C"/>
+                </w:rPr>
                 <m:t>=</m:t>
               </m:r>
               <m:r>
+                <w:rPr>
+                  <w:color w:val="1F4E9C"/>
+                </w:rPr>
                 <m:t>f</m:t>
               </m:r>
               <m:d>
@@ -28841,11 +29987,17 @@
                   <m:sSub>
                     <m:e>
                       <m:r>
+                        <w:rPr>
+                          <w:color w:val="1F4E9C"/>
+                        </w:rPr>
                         <m:t>u</m:t>
                       </m:r>
                     </m:e>
                     <m:sub>
                       <m:r>
+                        <w:rPr>
+                          <w:color w:val="1F4E9C"/>
+                        </w:rPr>
                         <m:t>n</m:t>
                       </m:r>
                     </m:sub>
@@ -28876,6 +30028,9 @@
                 <m:rPr>
                   <m:sty m:val="p"/>
                 </m:rPr>
+                <w:rPr>
+                  <w:color w:val="1F4E9C"/>
+                </w:rPr>
                 <m:t>ℓ</m:t>
               </m:r>
             </m:oMath>
@@ -28899,6 +30054,9 @@
             </w:r>
             <m:oMath>
               <m:r>
+                <w:rPr>
+                  <w:color w:val="1F4E9C"/>
+                </w:rPr>
                 <m:t>f</m:t>
               </m:r>
             </m:oMath>
@@ -28925,6 +30083,9 @@
                 <m:rPr>
                   <m:sty m:val="p"/>
                 </m:rPr>
+                <w:rPr>
+                  <w:color w:val="1F4E9C"/>
+                </w:rPr>
                 <m:t>ℓ</m:t>
               </m:r>
             </m:oMath>
@@ -33683,11 +34844,17 @@
                   <m:sSub>
                     <m:e>
                       <m:r>
+                        <w:rPr>
+                          <w:color w:val="1F4E9C"/>
+                        </w:rPr>
                         <m:t>u</m:t>
                       </m:r>
                     </m:e>
                     <m:sub>
                       <m:r>
+                        <w:rPr>
+                          <w:color w:val="1F4E9C"/>
+                        </w:rPr>
                         <m:t>n</m:t>
                       </m:r>
                     </m:sub>
@@ -33725,11 +34892,17 @@
                   <m:sSub>
                     <m:e>
                       <m:r>
+                        <w:rPr>
+                          <w:color w:val="1F4E9C"/>
+                        </w:rPr>
                         <m:t>v</m:t>
                       </m:r>
                     </m:e>
                     <m:sub>
                       <m:r>
+                        <w:rPr>
+                          <w:color w:val="1F4E9C"/>
+                        </w:rPr>
                         <m:t>n</m:t>
                       </m:r>
                     </m:sub>
@@ -33987,11 +35160,17 @@
                   <m:sSub>
                     <m:e>
                       <m:r>
+                        <w:rPr>
+                          <w:color w:val="1F4E9C"/>
+                        </w:rPr>
                         <m:t>u</m:t>
                       </m:r>
                     </m:e>
                     <m:sub>
                       <m:r>
+                        <w:rPr>
+                          <w:color w:val="1F4E9C"/>
+                        </w:rPr>
                         <m:t>n</m:t>
                       </m:r>
                     </m:sub>
@@ -34029,11 +35208,17 @@
                   <m:sSub>
                     <m:e>
                       <m:r>
+                        <w:rPr>
+                          <w:color w:val="1F4E9C"/>
+                        </w:rPr>
                         <m:t>v</m:t>
                       </m:r>
                     </m:e>
                     <m:sub>
                       <m:r>
+                        <w:rPr>
+                          <w:color w:val="1F4E9C"/>
+                        </w:rPr>
                         <m:t>n</m:t>
                       </m:r>
                     </m:sub>
@@ -34078,6 +35263,9 @@
                 <m:rPr>
                   <m:sty m:val="p"/>
                 </m:rPr>
+                <w:rPr>
+                  <w:color w:val="1F4E9C"/>
+                </w:rPr>
                 <m:t>ℓ</m:t>
               </m:r>
             </m:oMath>
@@ -34184,6 +35372,9 @@
             </w:r>
             <m:oMath>
               <m:r>
+                <w:rPr>
+                  <w:color w:val="1F4E9C"/>
+                </w:rPr>
                 <m:t>n</m:t>
               </m:r>
             </m:oMath>
@@ -40225,11 +41416,17 @@
               <m:sSub>
                 <m:e>
                   <m:r>
+                    <w:rPr>
+                      <w:color w:val="1F4E9C"/>
+                    </w:rPr>
                     <m:t>u</m:t>
                   </m:r>
                 </m:e>
                 <m:sub>
                   <m:r>
+                    <w:rPr>
+                      <w:color w:val="1F4E9C"/>
+                    </w:rPr>
                     <m:t>0</m:t>
                   </m:r>
                 </m:sub>
@@ -40257,20 +41454,32 @@
               <m:sSub>
                 <m:e>
                   <m:r>
+                    <w:rPr>
+                      <w:color w:val="1F4E9C"/>
+                    </w:rPr>
                     <m:t>u</m:t>
                   </m:r>
                 </m:e>
                 <m:sub>
                   <m:r>
+                    <w:rPr>
+                      <w:color w:val="1F4E9C"/>
+                    </w:rPr>
                     <m:t>n</m:t>
                   </m:r>
                   <m:r>
                     <m:rPr>
                       <m:sty m:val="p"/>
                     </m:rPr>
+                    <w:rPr>
+                      <w:color w:val="1F4E9C"/>
+                    </w:rPr>
                     <m:t>+</m:t>
                   </m:r>
                   <m:r>
+                    <w:rPr>
+                      <w:color w:val="1F4E9C"/>
+                    </w:rPr>
                     <m:t>1</m:t>
                   </m:r>
                 </m:sub>
@@ -40279,9 +41488,15 @@
                 <m:rPr>
                   <m:sty m:val="p"/>
                 </m:rPr>
+                <w:rPr>
+                  <w:color w:val="1F4E9C"/>
+                </w:rPr>
                 <m:t>=</m:t>
               </m:r>
               <m:r>
+                <w:rPr>
+                  <w:color w:val="1F4E9C"/>
+                </w:rPr>
                 <m:t>f</m:t>
               </m:r>
               <m:d>
@@ -40295,11 +41510,17 @@
                   <m:sSub>
                     <m:e>
                       <m:r>
+                        <w:rPr>
+                          <w:color w:val="1F4E9C"/>
+                        </w:rPr>
                         <m:t>u</m:t>
                       </m:r>
                     </m:e>
                     <m:sub>
                       <m:r>
+                        <w:rPr>
+                          <w:color w:val="1F4E9C"/>
+                        </w:rPr>
                         <m:t>n</m:t>
                       </m:r>
                     </m:sub>

</xml_diff>

<commit_message>
Complex numbers lesson plans 67-78 in the agreed detailed layout (official order); fix reversed iff statements
Co-Authored-By: Claude Opus 5.5 <noreply@anthropic.com>
Claude-Session: https://claude.ai/code/session_015WVgZKTbSWpZTjn6aZsqC9
</commit_message>
<xml_diff>
--- a/documents/3as/modhakirat/modhakira_wahda5_3as.docx
+++ b/documents/3as/modhakirat/modhakira_wahda5_3as.docx
@@ -9951,24 +9951,15 @@
               <w:rPr>
                 <w:rtl/>
               </w:rPr>
-              <w:t xml:space="preserve">حدود متتابعة</w:t>
-            </w:r>
-            <w:r>
-              <w:rPr>
-                <w:rtl/>
-              </w:rPr>
-              <w:t xml:space="preserve"> </w:t>
-            </w:r>
-            <m:oMath>
-              <m:r>
-                <m:rPr>
-                  <m:sty m:val="p"/>
-                </m:rPr>
-                <w:rPr>
-                  <w:color w:val="1F4E9C"/>
-                </w:rPr>
-                <m:t>⇔</m:t>
-              </m:r>
+              <w:t xml:space="preserve">حدود متتابعة إذا وفقط إذا كان</w:t>
+            </w:r>
+            <w:r>
+              <w:rPr>
+                <w:rtl/>
+              </w:rPr>
+              <w:t xml:space="preserve"> </w:t>
+            </w:r>
+            <m:oMath>
               <m:r>
                 <w:rPr>
                   <w:color w:val="1F4E9C"/>
@@ -10707,24 +10698,15 @@
               <w:rPr>
                 <w:rtl/>
               </w:rPr>
-              <w:t xml:space="preserve">حدود متتابعة</w:t>
-            </w:r>
-            <w:r>
-              <w:rPr>
-                <w:rtl/>
-              </w:rPr>
-              <w:t xml:space="preserve"> </w:t>
-            </w:r>
-            <m:oMath>
-              <m:r>
-                <m:rPr>
-                  <m:sty m:val="p"/>
-                </m:rPr>
-                <w:rPr>
-                  <w:color w:val="1F4E9C"/>
-                </w:rPr>
-                <m:t>⇔</m:t>
-              </m:r>
+              <w:t xml:space="preserve">حدود متتابعة إذا وفقط إذا كان</w:t>
+            </w:r>
+            <w:r>
+              <w:rPr>
+                <w:rtl/>
+              </w:rPr>
+              <w:t xml:space="preserve"> </w:t>
+            </w:r>
+            <m:oMath>
               <m:sSup>
                 <m:e>
                   <m:r>

</xml_diff>